<commit_message>
css hiontaa ja mobiilioptimointia(kesken). Raportin kirjottelua.
</commit_message>
<xml_diff>
--- a/Tuotekehitysraportti.docx
+++ b/Tuotekehitysraportti.docx
@@ -1169,16 +1169,16 @@
           <w:rFonts w:cstheme="minorHAnsi"/>
         </w:rPr>
       </w:pPr>
-      <w:bookmarkStart w:id="0" w:name="_Toc164496814"/>
-      <w:bookmarkStart w:id="1" w:name="_Toc166464152"/>
-      <w:bookmarkStart w:id="2" w:name="_Toc230592239"/>
-      <w:bookmarkStart w:id="3" w:name="_Toc230592492"/>
-      <w:bookmarkStart w:id="4" w:name="_Toc224836174"/>
+      <w:bookmarkStart w:id="0" w:name="_Toc224836174"/>
+      <w:bookmarkStart w:id="1" w:name="_Toc164496814"/>
+      <w:bookmarkStart w:id="2" w:name="_Toc166464152"/>
+      <w:bookmarkStart w:id="3" w:name="_Toc230592239"/>
+      <w:bookmarkStart w:id="4" w:name="_Toc230592492"/>
       <w:r>
         <w:lastRenderedPageBreak/>
         <w:t>Johdanto</w:t>
       </w:r>
-      <w:bookmarkEnd w:id="4"/>
+      <w:bookmarkEnd w:id="0"/>
     </w:p>
     <w:p>
       <w:pPr>
@@ -1360,149 +1360,21 @@
         <w:t>Tekoälyn käyttö tässä harjoitustyössä</w:t>
       </w:r>
       <w:bookmarkEnd w:id="6"/>
-    </w:p>
-    <w:p>
-      <w:pPr>
-        <w:rPr>
-          <w:rFonts w:cstheme="minorHAnsi"/>
-        </w:rPr>
-      </w:pPr>
-      <w:r>
-        <w:rPr>
-          <w:rFonts w:cstheme="minorHAnsi"/>
-        </w:rPr>
-        <w:t xml:space="preserve">Tässä työssä olen käyttänyt </w:t>
+      <w:r>
+        <w:t xml:space="preserve"> (Piita)</w:t>
+      </w:r>
+    </w:p>
+    <w:p>
+      <w:r>
+        <w:t xml:space="preserve">Hyödynsin tekoälyä CSS-tyylien kehittämisessä erityisesti ongelmatilanteiden ratkaisemiseen ja ulkoasun viimeistelyyn. Tekoäly auttoi esimerkiksi </w:t>
       </w:r>
       <w:proofErr w:type="spellStart"/>
       <w:r>
-        <w:rPr>
-          <w:rFonts w:cstheme="minorHAnsi"/>
-        </w:rPr>
-        <w:t>ChatGPT:tä</w:t>
+        <w:t>responsiivisuuden</w:t>
       </w:r>
       <w:proofErr w:type="spellEnd"/>
       <w:r>
-        <w:rPr>
-          <w:rFonts w:cstheme="minorHAnsi"/>
-        </w:rPr>
-        <w:t xml:space="preserve"> ja Microsoft </w:t>
-      </w:r>
-      <w:proofErr w:type="spellStart"/>
-      <w:r>
-        <w:rPr>
-          <w:rFonts w:cstheme="minorHAnsi"/>
-        </w:rPr>
-        <w:t>Copilotia</w:t>
-      </w:r>
-      <w:proofErr w:type="spellEnd"/>
-      <w:r>
-        <w:rPr>
-          <w:rFonts w:cstheme="minorHAnsi"/>
-        </w:rPr>
-        <w:t xml:space="preserve"> ideoinnin, tiedonhaun ja kielentarkistuksen välineenä. Olen muokannut tekstiä tekoälyn avulla useaan otteeseen, jotta kieli olisi selkeämpää ja helpommin ymmärrettävää, mutta välittäisi asiat yhä alkuperäisen tarkoitukseni mukaisesti. Kuva 4 (luvussa 3.1) on luotu </w:t>
-      </w:r>
-      <w:proofErr w:type="spellStart"/>
-      <w:r>
-        <w:rPr>
-          <w:rFonts w:cstheme="minorHAnsi"/>
-        </w:rPr>
-        <w:t>Copilotissa</w:t>
-      </w:r>
-      <w:proofErr w:type="spellEnd"/>
-      <w:r>
-        <w:rPr>
-          <w:rFonts w:cstheme="minorHAnsi"/>
-        </w:rPr>
-        <w:t xml:space="preserve"> kehotteella "tee kuva SWOT-analyysistä". Taulukko 5 (luvussa 4.2) on luotu </w:t>
-      </w:r>
-      <w:proofErr w:type="spellStart"/>
-      <w:r>
-        <w:rPr>
-          <w:rFonts w:cstheme="minorHAnsi"/>
-        </w:rPr>
-        <w:t>ChatGPT:ssä</w:t>
-      </w:r>
-      <w:proofErr w:type="spellEnd"/>
-      <w:r>
-        <w:rPr>
-          <w:rFonts w:cstheme="minorHAnsi"/>
-        </w:rPr>
-        <w:t xml:space="preserve"> kehotteella ”tee taulukko maailman kymmenestä pinta-alaltaan suurimmasta maasta. Sisällytä taulukkoon pinta-ala neliökilometreinä.” Tiedonhaussa olen käyttänyt tekoälyä apuna hakusanojen ja hakulausekkeiden muodostamisessa.</w:t>
-      </w:r>
-    </w:p>
-    <w:p>
-      <w:pPr>
-        <w:rPr>
-          <w:rFonts w:cstheme="minorHAnsi"/>
-        </w:rPr>
-      </w:pPr>
-      <w:r>
-        <w:rPr>
-          <w:rFonts w:cstheme="minorHAnsi"/>
-        </w:rPr>
-        <w:t xml:space="preserve">Olen huolehtinut sisällön alkuperäisyydestä ja tekijänoikeuksien kunnioittamisesta. Jos tekoälysovellus on tuottanut tekstiin uusia ideoita, olen aina tarkistanut ne alkuperäisistä lähteistä ja viitannut niihin asianmukaisesti. Kaikki ilmoittamani lähteet ovat itse käyttämiäni, eivät tekoälyn </w:t>
-      </w:r>
-      <w:r>
-        <w:rPr>
-          <w:rFonts w:cstheme="minorHAnsi"/>
-        </w:rPr>
-        <w:lastRenderedPageBreak/>
-        <w:t>tuottamia. Asia on tarkistettavissa muistiinpanoistani ja käyttämästäni viitteidenhallintajärjestelmästä.</w:t>
-      </w:r>
-    </w:p>
-    <w:p>
-      <w:pPr>
-        <w:rPr>
-          <w:rFonts w:cstheme="minorHAnsi"/>
-        </w:rPr>
-      </w:pPr>
-      <w:r>
-        <w:rPr>
-          <w:rFonts w:cstheme="minorHAnsi"/>
-        </w:rPr>
-        <w:t xml:space="preserve">Englanninkielisen tiivistelmän kirjoituksessa olen käyttänyt apuna </w:t>
-      </w:r>
-      <w:proofErr w:type="spellStart"/>
-      <w:r>
-        <w:rPr>
-          <w:rFonts w:cstheme="minorHAnsi"/>
-        </w:rPr>
-        <w:t>DeepL</w:t>
-      </w:r>
-      <w:proofErr w:type="spellEnd"/>
-      <w:r>
-        <w:rPr>
-          <w:rFonts w:cstheme="minorHAnsi"/>
-        </w:rPr>
-        <w:t xml:space="preserve"> </w:t>
-      </w:r>
-      <w:proofErr w:type="spellStart"/>
-      <w:r>
-        <w:rPr>
-          <w:rFonts w:cstheme="minorHAnsi"/>
-        </w:rPr>
-        <w:t>Translatoria</w:t>
-      </w:r>
-      <w:proofErr w:type="spellEnd"/>
-      <w:r>
-        <w:rPr>
-          <w:rFonts w:cstheme="minorHAnsi"/>
-        </w:rPr>
-        <w:t xml:space="preserve"> kääntämiseen ja </w:t>
-      </w:r>
-      <w:proofErr w:type="spellStart"/>
-      <w:r>
-        <w:rPr>
-          <w:rFonts w:cstheme="minorHAnsi"/>
-        </w:rPr>
-        <w:t>Grammarlya</w:t>
-      </w:r>
-      <w:proofErr w:type="spellEnd"/>
-      <w:r>
-        <w:rPr>
-          <w:rFonts w:cstheme="minorHAnsi"/>
-        </w:rPr>
-        <w:t xml:space="preserve"> kieliasun tarkistamisen. Olen käyttänyt kaikkia tekoälysovelluksia vastuullisesti ja huolehtinut tietosuojasta. Tämän luvun kirjoittamisessa en ole käyttänyt tekoälyä.</w:t>
+        <w:t xml:space="preserve"> toteutuksessa, elementtien keskittämisessä sekä korttirakenteen yhtenäistämisessä. Lopulliset ratkaisut valitsin ja muokkasin itse, jotta ne sopivat projektin kokonaisuuteen.</w:t>
       </w:r>
     </w:p>
     <w:p>
@@ -1738,771 +1610,524 @@
     </w:p>
     <w:p>
       <w:pPr>
-        <w:rPr>
-          <w:rFonts w:cstheme="minorHAnsi"/>
-        </w:rPr>
-      </w:pPr>
-    </w:p>
-    <w:p>
-      <w:pPr>
-        <w:rPr>
-          <w:rFonts w:cstheme="minorHAnsi"/>
-        </w:rPr>
-      </w:pPr>
-    </w:p>
-    <w:p>
-      <w:pPr>
-        <w:rPr>
-          <w:rFonts w:cstheme="minorHAnsi"/>
-        </w:rPr>
-      </w:pPr>
-    </w:p>
-    <w:p>
-      <w:pPr>
-        <w:rPr>
-          <w:rFonts w:cstheme="minorHAnsi"/>
-        </w:rPr>
-      </w:pPr>
-    </w:p>
-    <w:p>
-      <w:pPr>
         <w:pStyle w:val="Heading2"/>
       </w:pPr>
-      <w:bookmarkStart w:id="9" w:name="_Toc421090850"/>
-      <w:bookmarkStart w:id="10" w:name="_Toc224836179"/>
-      <w:r>
-        <w:t>Tyylien käyttö ja sisällysluettelo</w:t>
+      <w:r>
+        <w:lastRenderedPageBreak/>
+        <w:t>CSS Toteutus</w:t>
+      </w:r>
+    </w:p>
+    <w:p>
+      <w:pPr>
+        <w:rPr>
+          <w:rFonts w:cstheme="minorHAnsi"/>
+        </w:rPr>
+      </w:pPr>
+      <w:r>
+        <w:rPr>
+          <w:rFonts w:cstheme="minorHAnsi"/>
+        </w:rPr>
+        <w:t xml:space="preserve">Sivuston ulkoasu on toteutettu CSS:n avulla hyödyntäen </w:t>
+      </w:r>
+      <w:proofErr w:type="spellStart"/>
+      <w:r>
+        <w:rPr>
+          <w:rFonts w:cstheme="minorHAnsi"/>
+        </w:rPr>
+        <w:t>flexbox</w:t>
+      </w:r>
+      <w:proofErr w:type="spellEnd"/>
+      <w:r>
+        <w:rPr>
+          <w:rFonts w:cstheme="minorHAnsi"/>
+        </w:rPr>
+        <w:t xml:space="preserve">-layoutia, joka mahdollistaa elementtien joustavan asettelun eri näytöillä. Värit on </w:t>
+      </w:r>
+      <w:proofErr w:type="gramStart"/>
+      <w:r>
+        <w:rPr>
+          <w:rFonts w:cstheme="minorHAnsi"/>
+        </w:rPr>
+        <w:t>määritelty :</w:t>
+      </w:r>
+      <w:proofErr w:type="spellStart"/>
+      <w:r>
+        <w:rPr>
+          <w:rFonts w:cstheme="minorHAnsi"/>
+        </w:rPr>
+        <w:t>root</w:t>
+      </w:r>
+      <w:proofErr w:type="spellEnd"/>
+      <w:proofErr w:type="gramEnd"/>
+      <w:r>
+        <w:rPr>
+          <w:rFonts w:cstheme="minorHAnsi"/>
+        </w:rPr>
+        <w:t>-muuttujilla, mikä helpottaa tyylien hallintaa ja yhtenäisyyttä.</w:t>
+      </w:r>
+    </w:p>
+    <w:p>
+      <w:pPr>
+        <w:rPr>
+          <w:rFonts w:cstheme="minorHAnsi"/>
+        </w:rPr>
+      </w:pPr>
+      <w:r>
+        <w:rPr>
+          <w:rFonts w:cstheme="minorHAnsi"/>
+        </w:rPr>
+        <w:t xml:space="preserve">Käyttöliittymä on rakennettu uudelleenkäytettävistä komponenteista, kuten korteista ja palvelubokseista, joille on määritelty yhteiset tyylit kuten varjostus ja pyöristetyt kulmat. </w:t>
+      </w:r>
+      <w:proofErr w:type="spellStart"/>
+      <w:r>
+        <w:rPr>
+          <w:rFonts w:cstheme="minorHAnsi"/>
+        </w:rPr>
+        <w:t>Responsiivisuus</w:t>
+      </w:r>
+      <w:proofErr w:type="spellEnd"/>
+      <w:r>
+        <w:rPr>
+          <w:rFonts w:cstheme="minorHAnsi"/>
+        </w:rPr>
+        <w:t xml:space="preserve"> on toteutettu media </w:t>
+      </w:r>
+      <w:proofErr w:type="spellStart"/>
+      <w:r>
+        <w:rPr>
+          <w:rFonts w:cstheme="minorHAnsi"/>
+        </w:rPr>
+        <w:t>queryjen</w:t>
+      </w:r>
+      <w:proofErr w:type="spellEnd"/>
+      <w:r>
+        <w:rPr>
+          <w:rFonts w:cstheme="minorHAnsi"/>
+        </w:rPr>
+        <w:t xml:space="preserve"> avulla, jolloin sivu mukautuu mobiililaitteille ja sisältö asettuu selkeästi allekkain.</w:t>
+      </w:r>
+    </w:p>
+    <w:p>
+      <w:pPr>
+        <w:pStyle w:val="Heading2"/>
+        <w:rPr>
+          <w:lang w:val="en-GB"/>
+        </w:rPr>
+      </w:pPr>
+      <w:proofErr w:type="spellStart"/>
+      <w:r>
+        <w:rPr>
+          <w:lang w:val="en-GB"/>
+        </w:rPr>
+        <w:t>Tyyliohje</w:t>
+      </w:r>
+      <w:proofErr w:type="spellEnd"/>
+      <w:r>
+        <w:rPr>
+          <w:lang w:val="en-GB"/>
+        </w:rPr>
+        <w:t xml:space="preserve">, </w:t>
+      </w:r>
+      <w:proofErr w:type="spellStart"/>
+      <w:r>
+        <w:rPr>
+          <w:lang w:val="en-GB"/>
+        </w:rPr>
+        <w:t>desing</w:t>
+      </w:r>
+      <w:proofErr w:type="spellEnd"/>
+      <w:r>
+        <w:rPr>
+          <w:lang w:val="en-GB"/>
+        </w:rPr>
+        <w:t xml:space="preserve"> system </w:t>
+      </w:r>
+      <w:proofErr w:type="spellStart"/>
+      <w:r>
+        <w:rPr>
+          <w:lang w:val="en-GB"/>
+        </w:rPr>
+        <w:t>ja</w:t>
+      </w:r>
+      <w:proofErr w:type="spellEnd"/>
+      <w:r>
+        <w:rPr>
+          <w:lang w:val="en-GB"/>
+        </w:rPr>
+        <w:t xml:space="preserve"> </w:t>
+      </w:r>
+      <w:proofErr w:type="spellStart"/>
+      <w:r>
+        <w:rPr>
+          <w:lang w:val="en-GB"/>
+        </w:rPr>
+        <w:t>desing</w:t>
+      </w:r>
+      <w:proofErr w:type="spellEnd"/>
+      <w:r>
+        <w:rPr>
+          <w:lang w:val="en-GB"/>
+        </w:rPr>
+        <w:t xml:space="preserve"> rationale</w:t>
+      </w:r>
+      <w:r>
+        <w:rPr>
+          <w:lang w:val="en-GB"/>
+        </w:rPr>
+        <w:t xml:space="preserve"> </w:t>
+      </w:r>
+    </w:p>
+    <w:p>
+      <w:pPr>
+        <w:pStyle w:val="Heading3"/>
+      </w:pPr>
+      <w:r>
+        <w:t xml:space="preserve">Tyyliohje (Style </w:t>
+      </w:r>
+      <w:proofErr w:type="spellStart"/>
+      <w:r>
+        <w:t>guide</w:t>
+      </w:r>
+      <w:proofErr w:type="spellEnd"/>
+      <w:r>
+        <w:t>)</w:t>
+      </w:r>
+    </w:p>
+    <w:p>
+      <w:r>
+        <w:t>Sivuston visuaalinen ilme perustuu raikkaaseen ja selkeään siniseen värimaailmaan, joka tukee hyvin liikunta- ja hyvinvointiteemaa. Päävärit ovat vaaleansininen (#a3cbe1), sininen (#67ace0), valkoinen (#fefefe) ja musta (#111111). Värit luovat kontrastia ja tekevät sisällöstä helposti luettavaa.</w:t>
+      </w:r>
+    </w:p>
+    <w:p>
+      <w:r>
+        <w:t xml:space="preserve">Fonttina käytetään selkeää </w:t>
+      </w:r>
+      <w:proofErr w:type="spellStart"/>
+      <w:proofErr w:type="gramStart"/>
+      <w:r>
+        <w:t>sans-serif</w:t>
+      </w:r>
+      <w:proofErr w:type="spellEnd"/>
+      <w:r>
+        <w:t xml:space="preserve"> -fonttia</w:t>
+      </w:r>
+      <w:proofErr w:type="gramEnd"/>
+      <w:r>
+        <w:t xml:space="preserve"> (</w:t>
+      </w:r>
+      <w:proofErr w:type="spellStart"/>
+      <w:r>
+        <w:t>Arial</w:t>
+      </w:r>
+      <w:proofErr w:type="spellEnd"/>
+      <w:r>
+        <w:t>), joka on helppolukuinen eri laitteilla. Otsikot, leipäteksti ja painikkeet on pidetty yksinkertaisina ja yhtenäisinä koko sivuston läpi.</w:t>
+      </w:r>
+    </w:p>
+    <w:p>
+      <w:r>
+        <w:t xml:space="preserve">Painikkeet ovat pyöristettyjä ja kontrastivärisiä, jotta ne erottuvat selkeästi ja ohjaavat käyttäjää toimintaan. Linkeissä käytetään </w:t>
+      </w:r>
+      <w:proofErr w:type="spellStart"/>
+      <w:r>
+        <w:t>hover</w:t>
+      </w:r>
+      <w:proofErr w:type="spellEnd"/>
+      <w:r>
+        <w:t>-efektejä (alleviivaus), jotka parantavat käytettävyyttä.</w:t>
+      </w:r>
+    </w:p>
+    <w:p>
+      <w:pPr>
+        <w:pStyle w:val="Heading3"/>
+      </w:pPr>
+      <w:r>
+        <w:t xml:space="preserve">Design </w:t>
+      </w:r>
+      <w:proofErr w:type="spellStart"/>
+      <w:r>
+        <w:t>system</w:t>
+      </w:r>
+      <w:proofErr w:type="spellEnd"/>
+      <w:r>
+        <w:t xml:space="preserve"> (lyhyesti</w:t>
+      </w:r>
+      <w:r>
+        <w:t>)</w:t>
+      </w:r>
+    </w:p>
+    <w:p>
+      <w:r>
+        <w:t>Sivusto on rakennettu modulaarisesti käyttäen toistuvia komponentteja, kuten kortteja (</w:t>
+      </w:r>
+      <w:proofErr w:type="spellStart"/>
+      <w:r>
+        <w:t>card</w:t>
+      </w:r>
+      <w:proofErr w:type="spellEnd"/>
+      <w:r>
+        <w:t xml:space="preserve">), palvelubokseja ja </w:t>
+      </w:r>
+      <w:proofErr w:type="spellStart"/>
+      <w:r>
+        <w:t>grid</w:t>
+      </w:r>
+      <w:proofErr w:type="spellEnd"/>
+      <w:r>
+        <w:t>-rakenteita. Tämä tekee käyttöliittymästä yhtenäisen ja helposti laajennettavan.</w:t>
+      </w:r>
+    </w:p>
+    <w:p>
+      <w:r>
+        <w:lastRenderedPageBreak/>
+        <w:t xml:space="preserve">Layout perustuu pääasiassa </w:t>
+      </w:r>
+      <w:proofErr w:type="spellStart"/>
+      <w:r>
+        <w:t>flexboxiin</w:t>
+      </w:r>
+      <w:proofErr w:type="spellEnd"/>
+      <w:r>
+        <w:t>, jonka avulla sisältö mukautuu eri näytön kokoihin. Kortit ja sisältöelementit noudattavat samaa rakennetta: taustaväri, varjostus ja pyöristetyt kulmat.</w:t>
+      </w:r>
+    </w:p>
+    <w:p>
+      <w:proofErr w:type="spellStart"/>
+      <w:r>
+        <w:t>Responsiivisuus</w:t>
+      </w:r>
+      <w:proofErr w:type="spellEnd"/>
+      <w:r>
+        <w:t xml:space="preserve"> on toteutettu media </w:t>
+      </w:r>
+      <w:proofErr w:type="spellStart"/>
+      <w:r>
+        <w:t>queryjen</w:t>
+      </w:r>
+      <w:proofErr w:type="spellEnd"/>
+      <w:r>
+        <w:t xml:space="preserve"> avulla, jolloin sivusto toimii sekä mobiililaitteilla että suuremmilla näytöillä. </w:t>
+      </w:r>
+      <w:proofErr w:type="gramStart"/>
+      <w:r>
+        <w:t>Mobiilissa</w:t>
+      </w:r>
+      <w:proofErr w:type="gramEnd"/>
+      <w:r>
+        <w:t xml:space="preserve"> sisältö asettuu allekkain ja pysyy helposti luettavana.</w:t>
+      </w:r>
+    </w:p>
+    <w:p>
+      <w:pPr>
+        <w:pStyle w:val="Heading3"/>
+      </w:pPr>
+      <w:r>
+        <w:t xml:space="preserve">Design </w:t>
+      </w:r>
+      <w:proofErr w:type="spellStart"/>
+      <w:r>
+        <w:t>rationale</w:t>
+      </w:r>
+      <w:proofErr w:type="spellEnd"/>
+    </w:p>
+    <w:p>
+      <w:r>
+        <w:t>1. Väriteeman valinta</w:t>
+      </w:r>
+    </w:p>
+    <w:p>
+      <w:r>
+        <w:t>Valitsimme sinisen värimaailman, koska se viestii luotettavuutta, energiaa ja hyvinvointia. Värit sopivat hyvin kuntosali- ja liikuntaympäristöön.</w:t>
+      </w:r>
+    </w:p>
+    <w:p>
+      <w:r>
+        <w:t>2. Korttipohjainen rakenne</w:t>
+      </w:r>
+    </w:p>
+    <w:p>
+      <w:r>
+        <w:t>Käytimme korttipohjaista layoutia, koska se tekee sisällöstä selkeää ja helposti hahmotettavaa. Kortit auttavat jakamaan informaation loogisiin osiin ja toimivat hyvin myös mobiilissa.</w:t>
+      </w:r>
+    </w:p>
+    <w:p>
+      <w:r>
+        <w:t>3</w:t>
+      </w:r>
+      <w:r>
+        <w:t>. Keskitetty sisältö ja tyhjä tila</w:t>
+      </w:r>
+    </w:p>
+    <w:p>
+      <w:r>
+        <w:t>Sisältö on keskitetty ja reunoihin jätettiin tyhjää tilaa. Tämä tekee sivusta visuaalisesti selkeämmän ja helpommin luettavan.</w:t>
+      </w:r>
+    </w:p>
+    <w:p>
+      <w:r>
+        <w:t>4</w:t>
+      </w:r>
+      <w:r>
+        <w:t>. Interaktiiviset elementit</w:t>
+      </w:r>
+    </w:p>
+    <w:p>
+      <w:r>
+        <w:t xml:space="preserve">Lisäsimme </w:t>
+      </w:r>
+      <w:proofErr w:type="spellStart"/>
+      <w:r>
+        <w:t>hover</w:t>
+      </w:r>
+      <w:proofErr w:type="spellEnd"/>
+      <w:r>
+        <w:t>-efektejä painikkeisiin ja linkkeihin, jotta käyttäjä saa visuaalista palautetta. Tämä tekee käyttöliittymästä intuitiivisemman ja miellyttävämmän käyttää.</w:t>
+      </w:r>
+    </w:p>
+    <w:p/>
+    <w:p>
+      <w:pPr>
+        <w:pStyle w:val="Heading2"/>
+      </w:pPr>
+      <w:bookmarkStart w:id="9" w:name="_Toc224836181"/>
+      <w:r>
+        <w:lastRenderedPageBreak/>
+        <w:t>Lähdeviittaukset ja lähdeluettelon teko</w:t>
       </w:r>
       <w:bookmarkEnd w:id="9"/>
-      <w:bookmarkEnd w:id="10"/>
-    </w:p>
-    <w:p>
-      <w:pPr>
-        <w:rPr>
-          <w:rFonts w:cstheme="minorHAnsi"/>
-        </w:rPr>
-      </w:pPr>
-      <w:r>
-        <w:rPr>
-          <w:rFonts w:cstheme="minorHAnsi"/>
-        </w:rPr>
-        <w:t xml:space="preserve">Tekstiin liitetty tyyli saadaan selville viemällä kursori halutun tekstikappaleen päälle ja klikkaamalla hiirtä ja katsomalla tyylivalikosta valittuna oleva tyyli </w:t>
-      </w:r>
-      <w:r>
-        <w:rPr>
-          <w:rFonts w:cstheme="minorHAnsi"/>
-        </w:rPr>
-        <w:t>(</w:t>
-      </w:r>
-      <w:r>
-        <w:rPr>
-          <w:rFonts w:cstheme="minorHAnsi"/>
-        </w:rPr>
-        <w:fldChar w:fldCharType="begin"/>
-      </w:r>
-      <w:r>
-        <w:rPr>
-          <w:rFonts w:cstheme="minorHAnsi"/>
-        </w:rPr>
-        <w:instrText xml:space="preserve"> REF _Ref184814731 \h </w:instrText>
-      </w:r>
-      <w:r>
-        <w:rPr>
-          <w:rFonts w:cstheme="minorHAnsi"/>
-        </w:rPr>
-        <w:instrText xml:space="preserve"> \* MERGEFORMAT </w:instrText>
-      </w:r>
-      <w:r>
-        <w:rPr>
-          <w:rFonts w:cstheme="minorHAnsi"/>
-        </w:rPr>
-      </w:r>
-      <w:r>
-        <w:rPr>
-          <w:rFonts w:cstheme="minorHAnsi"/>
-        </w:rPr>
-        <w:fldChar w:fldCharType="separate"/>
-      </w:r>
-      <w:r>
-        <w:t xml:space="preserve">Kuva </w:t>
-      </w:r>
-      <w:r>
-        <w:rPr>
-          <w:noProof/>
-        </w:rPr>
-        <w:t>1</w:t>
-      </w:r>
-      <w:r>
-        <w:rPr>
-          <w:rFonts w:cstheme="minorHAnsi"/>
-        </w:rPr>
-        <w:fldChar w:fldCharType="end"/>
-      </w:r>
-      <w:r>
-        <w:rPr>
-          <w:rFonts w:cstheme="minorHAnsi"/>
-        </w:rPr>
-        <w:t>)</w:t>
-      </w:r>
-      <w:r>
-        <w:rPr>
-          <w:rFonts w:cstheme="minorHAnsi"/>
+    </w:p>
+    <w:p>
+      <w:pPr>
+        <w:rPr>
+          <w:rFonts w:cstheme="minorHAnsi"/>
+          <w:szCs w:val="20"/>
+        </w:rPr>
+      </w:pPr>
+      <w:r>
+        <w:rPr>
+          <w:rFonts w:cstheme="minorHAnsi"/>
+          <w:szCs w:val="20"/>
+        </w:rPr>
+        <w:t>Käytä</w:t>
+      </w:r>
+      <w:r>
+        <w:rPr>
+          <w:rFonts w:cstheme="minorHAnsi"/>
+          <w:szCs w:val="20"/>
+        </w:rPr>
+        <w:t xml:space="preserve"> </w:t>
+      </w:r>
+      <w:r>
+        <w:rPr>
+          <w:rFonts w:cstheme="minorHAnsi"/>
+          <w:szCs w:val="20"/>
+        </w:rPr>
+        <w:t xml:space="preserve">APA 7 -viittaustyylistä nimiviittausta. </w:t>
+      </w:r>
+      <w:r>
+        <w:rPr>
+          <w:rFonts w:cstheme="minorHAnsi"/>
+          <w:szCs w:val="20"/>
+        </w:rPr>
+        <w:t xml:space="preserve">Esimerkkejä löydät kirjoitusohjeista (Tritonia, </w:t>
+      </w:r>
+      <w:proofErr w:type="spellStart"/>
+      <w:r>
+        <w:rPr>
+          <w:rFonts w:cstheme="minorHAnsi"/>
+          <w:szCs w:val="20"/>
+        </w:rPr>
+        <w:t>n.d</w:t>
+      </w:r>
+      <w:proofErr w:type="spellEnd"/>
+      <w:r>
+        <w:rPr>
+          <w:rFonts w:cstheme="minorHAnsi"/>
+          <w:szCs w:val="20"/>
+        </w:rPr>
+        <w:t>).</w:t>
+      </w:r>
+    </w:p>
+    <w:p>
+      <w:pPr>
+        <w:rPr>
+          <w:rFonts w:cstheme="minorHAnsi"/>
+          <w:szCs w:val="20"/>
+        </w:rPr>
+      </w:pPr>
+      <w:r>
+        <w:rPr>
+          <w:rFonts w:cstheme="minorHAnsi"/>
+          <w:szCs w:val="20"/>
+        </w:rPr>
+        <w:t xml:space="preserve">Jokainen lähde, johon tekstissä on viitattu, mainitaan myös lähdeluettelossa. Vastaavasti jokaisesta lähdeluettelossa mainitusta lähteestä tulee olla viittaus tekstissä. </w:t>
+      </w:r>
+    </w:p>
+    <w:p>
+      <w:pPr>
+        <w:rPr>
+          <w:rFonts w:cstheme="minorHAnsi"/>
+          <w:szCs w:val="20"/>
+        </w:rPr>
+      </w:pPr>
+      <w:r>
+        <w:rPr>
+          <w:rFonts w:cstheme="minorHAnsi"/>
+          <w:szCs w:val="20"/>
+        </w:rPr>
+        <w:t xml:space="preserve">Ota käyttöösi </w:t>
+      </w:r>
+      <w:proofErr w:type="spellStart"/>
+      <w:r>
+        <w:rPr>
+          <w:rFonts w:cstheme="minorHAnsi"/>
+          <w:szCs w:val="20"/>
+        </w:rPr>
+        <w:t>Mendeley</w:t>
+      </w:r>
+      <w:proofErr w:type="spellEnd"/>
+      <w:r>
+        <w:rPr>
+          <w:rFonts w:cstheme="minorHAnsi"/>
+          <w:szCs w:val="20"/>
+        </w:rPr>
+        <w:t xml:space="preserve"> tai </w:t>
+      </w:r>
+      <w:proofErr w:type="spellStart"/>
+      <w:r>
+        <w:rPr>
+          <w:rFonts w:cstheme="minorHAnsi"/>
+          <w:szCs w:val="20"/>
+        </w:rPr>
+        <w:t>Zotero</w:t>
+      </w:r>
+      <w:proofErr w:type="spellEnd"/>
+      <w:r>
+        <w:rPr>
+          <w:rFonts w:cstheme="minorHAnsi"/>
+          <w:szCs w:val="20"/>
+        </w:rPr>
+        <w:t xml:space="preserve"> ja kerää eri harjoitustöissä käyttämiäsi lähteitä. Niistä voi olla hyötyä opinnäytetyötä kirjoittaessasi</w:t>
+      </w:r>
+      <w:r>
+        <w:rPr>
+          <w:rFonts w:cstheme="minorHAnsi"/>
+          <w:szCs w:val="20"/>
         </w:rPr>
         <w:t>.</w:t>
       </w:r>
-      <w:r>
-        <w:rPr>
-          <w:rFonts w:cstheme="minorHAnsi"/>
-        </w:rPr>
-        <w:t xml:space="preserve"> Samasta ikkunasta voidaan vaihtaa valittuun tekstiin kiinnitettyä tyyliä.</w:t>
-      </w:r>
-    </w:p>
-    <w:p>
-      <w:pPr>
-        <w:keepNext/>
-      </w:pPr>
-      <w:r>
-        <w:rPr>
-          <w:rFonts w:cstheme="minorHAnsi"/>
-          <w:noProof/>
-        </w:rPr>
-        <w:drawing>
-          <wp:inline distT="0" distB="0" distL="0" distR="0" wp14:anchorId="46D8A41F" wp14:editId="001D204B">
-            <wp:extent cx="2708563" cy="2446444"/>
-            <wp:effectExtent l="0" t="0" r="0" b="0"/>
-            <wp:docPr id="680112540" name="Picture 1" descr="Kuvakaappaus Wordin tyyleistä."/>
-            <wp:cNvGraphicFramePr>
-              <a:graphicFrameLocks xmlns:a="http://schemas.openxmlformats.org/drawingml/2006/main" noChangeAspect="1"/>
-            </wp:cNvGraphicFramePr>
-            <a:graphic xmlns:a="http://schemas.openxmlformats.org/drawingml/2006/main">
-              <a:graphicData uri="http://schemas.openxmlformats.org/drawingml/2006/picture">
-                <pic:pic xmlns:pic="http://schemas.openxmlformats.org/drawingml/2006/picture">
-                  <pic:nvPicPr>
-                    <pic:cNvPr id="680112540" name="Picture 1" descr="Kuvakaappaus Wordin tyyleistä."/>
-                    <pic:cNvPicPr/>
-                  </pic:nvPicPr>
-                  <pic:blipFill>
-                    <a:blip r:embed="rId11"/>
-                    <a:stretch>
-                      <a:fillRect/>
-                    </a:stretch>
-                  </pic:blipFill>
-                  <pic:spPr>
-                    <a:xfrm>
-                      <a:off x="0" y="0"/>
-                      <a:ext cx="2717685" cy="2454683"/>
-                    </a:xfrm>
-                    <a:prstGeom prst="rect">
-                      <a:avLst/>
-                    </a:prstGeom>
-                  </pic:spPr>
-                </pic:pic>
-              </a:graphicData>
-            </a:graphic>
-          </wp:inline>
-        </w:drawing>
-      </w:r>
-    </w:p>
-    <w:p>
-      <w:pPr>
-        <w:pStyle w:val="Caption"/>
-        <w:jc w:val="both"/>
-        <w:rPr>
-          <w:rFonts w:cstheme="minorHAnsi"/>
-        </w:rPr>
-      </w:pPr>
-      <w:bookmarkStart w:id="11" w:name="_Ref184814731"/>
-      <w:bookmarkStart w:id="12" w:name="_Toc184814872"/>
-      <w:r>
-        <w:t xml:space="preserve">Kuva </w:t>
-      </w:r>
-      <w:fldSimple w:instr=" SEQ Kuva \* ARABIC ">
-        <w:r>
-          <w:rPr>
-            <w:noProof/>
-          </w:rPr>
-          <w:t>1</w:t>
-        </w:r>
-      </w:fldSimple>
-      <w:bookmarkEnd w:id="11"/>
-      <w:r>
-        <w:t>. Tyylin valinta Wordissa.</w:t>
-      </w:r>
-      <w:bookmarkEnd w:id="12"/>
-    </w:p>
-    <w:p>
-      <w:pPr>
-        <w:rPr>
-          <w:rFonts w:cstheme="minorHAnsi"/>
-        </w:rPr>
-      </w:pPr>
-    </w:p>
-    <w:p>
-      <w:pPr>
-        <w:rPr>
-          <w:rFonts w:cstheme="minorHAnsi"/>
-        </w:rPr>
-      </w:pPr>
-      <w:r>
-        <w:rPr>
-          <w:rFonts w:cstheme="minorHAnsi"/>
-        </w:rPr>
-        <w:t xml:space="preserve">Kun otsikko on </w:t>
-      </w:r>
-      <w:r>
-        <w:rPr>
-          <w:rFonts w:cstheme="minorHAnsi"/>
-        </w:rPr>
-        <w:t>muotoil</w:t>
-      </w:r>
-      <w:r>
-        <w:rPr>
-          <w:rFonts w:cstheme="minorHAnsi"/>
-        </w:rPr>
-        <w:t>tu</w:t>
-      </w:r>
-      <w:r>
-        <w:rPr>
-          <w:rFonts w:cstheme="minorHAnsi"/>
-        </w:rPr>
-        <w:t xml:space="preserve"> ko</w:t>
-      </w:r>
-      <w:r>
-        <w:rPr>
-          <w:rFonts w:cstheme="minorHAnsi"/>
-        </w:rPr>
-        <w:t>.</w:t>
-      </w:r>
-      <w:r>
-        <w:rPr>
-          <w:rFonts w:cstheme="minorHAnsi"/>
-        </w:rPr>
-        <w:t xml:space="preserve"> tyylejä käyttäen, </w:t>
-      </w:r>
-      <w:r>
-        <w:rPr>
-          <w:rFonts w:cstheme="minorHAnsi"/>
-        </w:rPr>
-        <w:t>sisällysluettelon</w:t>
-      </w:r>
-      <w:r>
-        <w:rPr>
-          <w:rFonts w:cstheme="minorHAnsi"/>
-        </w:rPr>
-        <w:t xml:space="preserve"> voi päivittää</w:t>
-      </w:r>
-      <w:r>
-        <w:rPr>
-          <w:rFonts w:cstheme="minorHAnsi"/>
-        </w:rPr>
-        <w:t xml:space="preserve"> painamalla hiirellä sisällysluettelon päällä ja valitsemalla </w:t>
-      </w:r>
-      <w:r>
-        <w:rPr>
-          <w:rFonts w:cstheme="minorHAnsi"/>
-        </w:rPr>
-        <w:t>”</w:t>
-      </w:r>
-      <w:proofErr w:type="spellStart"/>
-      <w:r>
-        <w:rPr>
-          <w:rFonts w:cstheme="minorHAnsi"/>
-        </w:rPr>
-        <w:t>update</w:t>
-      </w:r>
-      <w:proofErr w:type="spellEnd"/>
-      <w:r>
-        <w:rPr>
-          <w:rFonts w:cstheme="minorHAnsi"/>
-        </w:rPr>
-        <w:t xml:space="preserve"> </w:t>
-      </w:r>
-      <w:proofErr w:type="spellStart"/>
-      <w:r>
-        <w:rPr>
-          <w:rFonts w:cstheme="minorHAnsi"/>
-        </w:rPr>
-        <w:t>field</w:t>
-      </w:r>
-      <w:proofErr w:type="spellEnd"/>
-      <w:r>
-        <w:rPr>
-          <w:rFonts w:cstheme="minorHAnsi"/>
-        </w:rPr>
-        <w:t>”</w:t>
-      </w:r>
-      <w:r>
-        <w:rPr>
-          <w:rFonts w:cstheme="minorHAnsi"/>
-        </w:rPr>
-        <w:t xml:space="preserve"> ja valitsemalla </w:t>
-      </w:r>
-      <w:r>
-        <w:rPr>
-          <w:rFonts w:cstheme="minorHAnsi"/>
-        </w:rPr>
-        <w:t>”</w:t>
-      </w:r>
-      <w:proofErr w:type="spellStart"/>
-      <w:r>
-        <w:rPr>
-          <w:rFonts w:cstheme="minorHAnsi"/>
-        </w:rPr>
-        <w:t>update</w:t>
-      </w:r>
-      <w:proofErr w:type="spellEnd"/>
-      <w:r>
-        <w:rPr>
-          <w:rFonts w:cstheme="minorHAnsi"/>
-        </w:rPr>
-        <w:t xml:space="preserve"> </w:t>
-      </w:r>
-      <w:proofErr w:type="spellStart"/>
-      <w:r>
-        <w:rPr>
-          <w:rFonts w:cstheme="minorHAnsi"/>
-        </w:rPr>
-        <w:t>entire</w:t>
-      </w:r>
-      <w:proofErr w:type="spellEnd"/>
-      <w:r>
-        <w:rPr>
-          <w:rFonts w:cstheme="minorHAnsi"/>
-        </w:rPr>
-        <w:t xml:space="preserve"> </w:t>
-      </w:r>
-      <w:proofErr w:type="spellStart"/>
-      <w:r>
-        <w:rPr>
-          <w:rFonts w:cstheme="minorHAnsi"/>
-        </w:rPr>
-        <w:t>table</w:t>
-      </w:r>
-      <w:proofErr w:type="spellEnd"/>
-      <w:r>
-        <w:rPr>
-          <w:rFonts w:cstheme="minorHAnsi"/>
-        </w:rPr>
-        <w:t>”</w:t>
-      </w:r>
-      <w:r>
-        <w:rPr>
-          <w:rFonts w:cstheme="minorHAnsi"/>
-        </w:rPr>
-        <w:t>.</w:t>
-      </w:r>
-      <w:r>
-        <w:rPr>
-          <w:rFonts w:cstheme="minorHAnsi"/>
-        </w:rPr>
-        <w:t xml:space="preserve"> Tiivistelmä-, </w:t>
-      </w:r>
-      <w:proofErr w:type="spellStart"/>
-      <w:r>
-        <w:rPr>
-          <w:rFonts w:cstheme="minorHAnsi"/>
-        </w:rPr>
-        <w:t>Abstract</w:t>
-      </w:r>
-      <w:proofErr w:type="spellEnd"/>
-      <w:r>
-        <w:rPr>
-          <w:rFonts w:cstheme="minorHAnsi"/>
-        </w:rPr>
-        <w:t xml:space="preserve">-, </w:t>
-      </w:r>
-      <w:r>
-        <w:rPr>
-          <w:rFonts w:cstheme="minorHAnsi"/>
-        </w:rPr>
-        <w:t>sisällysluettelo</w:t>
-      </w:r>
-      <w:r>
-        <w:rPr>
-          <w:rFonts w:cstheme="minorHAnsi"/>
-        </w:rPr>
-        <w:t xml:space="preserve"> ja liiteluettelo</w:t>
-      </w:r>
-      <w:r>
-        <w:rPr>
-          <w:rFonts w:cstheme="minorHAnsi"/>
-        </w:rPr>
-        <w:t>sivuilla otsikoissa ei käytetä valmiita otsikko</w:t>
-      </w:r>
-      <w:r>
-        <w:rPr>
-          <w:rFonts w:cstheme="minorHAnsi"/>
-        </w:rPr>
-        <w:lastRenderedPageBreak/>
-        <w:t>tyylejä</w:t>
-      </w:r>
-      <w:r>
-        <w:rPr>
-          <w:rFonts w:cstheme="minorHAnsi"/>
-        </w:rPr>
-        <w:t xml:space="preserve"> (otsikon koko 14)</w:t>
-      </w:r>
-      <w:r>
-        <w:rPr>
-          <w:rFonts w:cstheme="minorHAnsi"/>
-        </w:rPr>
-        <w:t>, näiden sivujen varsinaisissa teksteissä käytetään tyyliä Tiivistelmä</w:t>
-      </w:r>
-      <w:r>
-        <w:rPr>
-          <w:rFonts w:cstheme="minorHAnsi"/>
-        </w:rPr>
-        <w:t xml:space="preserve"> </w:t>
-      </w:r>
-      <w:r>
-        <w:rPr>
-          <w:rFonts w:cstheme="minorHAnsi"/>
-        </w:rPr>
-        <w:t>(tekstikoko 1</w:t>
-      </w:r>
-      <w:r>
-        <w:rPr>
-          <w:rFonts w:cstheme="minorHAnsi"/>
-        </w:rPr>
-        <w:t>1</w:t>
-      </w:r>
-      <w:r>
-        <w:rPr>
-          <w:rFonts w:cstheme="minorHAnsi"/>
-        </w:rPr>
-        <w:t xml:space="preserve">, riviväli 1, </w:t>
-      </w:r>
-      <w:r>
-        <w:rPr>
-          <w:rFonts w:cstheme="minorHAnsi"/>
-        </w:rPr>
-        <w:t>merkkien välinen etäisyys</w:t>
-      </w:r>
-      <w:r>
-        <w:rPr>
-          <w:rFonts w:cstheme="minorHAnsi"/>
-        </w:rPr>
-        <w:t xml:space="preserve"> 12</w:t>
-      </w:r>
-      <w:r>
-        <w:rPr>
-          <w:rFonts w:cstheme="minorHAnsi"/>
-        </w:rPr>
-        <w:t xml:space="preserve"> </w:t>
-      </w:r>
-      <w:r>
-        <w:rPr>
-          <w:rFonts w:cstheme="minorHAnsi"/>
-        </w:rPr>
-        <w:t>pt)</w:t>
-      </w:r>
-      <w:r>
-        <w:rPr>
-          <w:rFonts w:cstheme="minorHAnsi"/>
-        </w:rPr>
-        <w:t xml:space="preserve">. </w:t>
-      </w:r>
-    </w:p>
-    <w:p>
-      <w:pPr>
-        <w:rPr>
-          <w:rFonts w:cstheme="minorHAnsi"/>
-        </w:rPr>
-      </w:pPr>
-      <w:r>
-        <w:rPr>
-          <w:rFonts w:cstheme="minorHAnsi"/>
-        </w:rPr>
-        <w:t xml:space="preserve">Useimmiten ongelmat ulkoasussa johtuvat siitä, että tekstissä </w:t>
-      </w:r>
-      <w:proofErr w:type="gramStart"/>
-      <w:r>
-        <w:rPr>
-          <w:rFonts w:cstheme="minorHAnsi"/>
-        </w:rPr>
-        <w:t>on</w:t>
-      </w:r>
-      <w:r>
-        <w:rPr>
-          <w:rFonts w:cstheme="minorHAnsi"/>
-        </w:rPr>
-        <w:t xml:space="preserve"> joko</w:t>
-      </w:r>
-      <w:r>
-        <w:rPr>
-          <w:rFonts w:cstheme="minorHAnsi"/>
-        </w:rPr>
-        <w:t xml:space="preserve"> väärä</w:t>
-      </w:r>
-      <w:r>
-        <w:rPr>
-          <w:rFonts w:cstheme="minorHAnsi"/>
-        </w:rPr>
-        <w:t xml:space="preserve"> </w:t>
-      </w:r>
-      <w:r>
-        <w:rPr>
-          <w:rFonts w:cstheme="minorHAnsi"/>
-        </w:rPr>
-        <w:t>tyyli</w:t>
-      </w:r>
-      <w:r>
-        <w:rPr>
-          <w:rFonts w:cstheme="minorHAnsi"/>
-        </w:rPr>
-        <w:t xml:space="preserve"> tai tyyli on</w:t>
-      </w:r>
-      <w:proofErr w:type="gramEnd"/>
-      <w:r>
-        <w:rPr>
-          <w:rFonts w:cstheme="minorHAnsi"/>
-        </w:rPr>
-        <w:t xml:space="preserve"> kopioidessa siirtynyt toisesta Word-dokumentista</w:t>
-      </w:r>
-      <w:r>
-        <w:rPr>
-          <w:rFonts w:cstheme="minorHAnsi"/>
-        </w:rPr>
-        <w:t>.</w:t>
-      </w:r>
-    </w:p>
-    <w:p>
-      <w:pPr>
-        <w:pStyle w:val="Heading2"/>
-      </w:pPr>
-      <w:bookmarkStart w:id="13" w:name="_Toc224836180"/>
-      <w:r>
-        <w:t>Kuvat, kuviot ja taulukot</w:t>
-      </w:r>
-      <w:bookmarkEnd w:id="13"/>
-      <w:r>
-        <w:t xml:space="preserve"> </w:t>
-      </w:r>
-    </w:p>
-    <w:p>
-      <w:pPr>
-        <w:rPr>
-          <w:rFonts w:cstheme="minorHAnsi"/>
-        </w:rPr>
-      </w:pPr>
-      <w:r>
-        <w:rPr>
-          <w:rFonts w:cstheme="minorHAnsi"/>
-        </w:rPr>
-        <w:t>Kuvioihin</w:t>
-      </w:r>
-      <w:r>
-        <w:rPr>
-          <w:rFonts w:cstheme="minorHAnsi"/>
-        </w:rPr>
-        <w:t xml:space="preserve">, </w:t>
-      </w:r>
-      <w:r>
-        <w:rPr>
-          <w:rFonts w:cstheme="minorHAnsi"/>
-        </w:rPr>
-        <w:t>kuviin ja taulukoihin on viitattava tekstikappaleissa.</w:t>
-      </w:r>
-      <w:r>
-        <w:rPr>
-          <w:rFonts w:cstheme="minorHAnsi"/>
-        </w:rPr>
-        <w:t xml:space="preserve"> Kuva-, kuvio- tai taulukkotekstin (</w:t>
-      </w:r>
-      <w:proofErr w:type="spellStart"/>
-      <w:r>
-        <w:rPr>
-          <w:rFonts w:cstheme="minorHAnsi"/>
-        </w:rPr>
-        <w:t>caption</w:t>
-      </w:r>
-      <w:proofErr w:type="spellEnd"/>
-      <w:r>
-        <w:rPr>
-          <w:rFonts w:cstheme="minorHAnsi"/>
-        </w:rPr>
-        <w:t>) tulee olla samalla sivulla kuin kyseinen kuva, kuvio tai taulukko. Kuvissa ja kuvioissa teksti on alapuolella, taulukoissa yläpuolella.</w:t>
-      </w:r>
-    </w:p>
-    <w:p>
-      <w:pPr>
-        <w:rPr>
-          <w:rFonts w:cstheme="minorHAnsi"/>
-        </w:rPr>
-      </w:pPr>
-      <w:r>
-        <w:rPr>
-          <w:rFonts w:cstheme="minorHAnsi"/>
-        </w:rPr>
-        <w:t>Huomioi saavutettavuus lisäämällä kuviin</w:t>
-      </w:r>
-      <w:r>
-        <w:rPr>
-          <w:rFonts w:cstheme="minorHAnsi"/>
-        </w:rPr>
-        <w:t xml:space="preserve"> ja </w:t>
-      </w:r>
-      <w:r>
-        <w:rPr>
-          <w:rFonts w:cstheme="minorHAnsi"/>
-        </w:rPr>
-        <w:t xml:space="preserve">kuvioihin vaihtoehtoinen teksti ja määrittelemällä taulukoille </w:t>
-      </w:r>
-      <w:r>
-        <w:rPr>
-          <w:rFonts w:cstheme="minorHAnsi"/>
-        </w:rPr>
-        <w:t xml:space="preserve">toistuva </w:t>
-      </w:r>
-      <w:r>
-        <w:rPr>
-          <w:rFonts w:cstheme="minorHAnsi"/>
-        </w:rPr>
-        <w:t xml:space="preserve">otsikkorivi. </w:t>
-      </w:r>
-    </w:p>
-    <w:p>
-      <w:pPr>
-        <w:pStyle w:val="Heading2"/>
-      </w:pPr>
-      <w:bookmarkStart w:id="14" w:name="_Toc224836181"/>
-      <w:r>
-        <w:t>Lähdeviittaukset ja lähdeluettelon teko</w:t>
-      </w:r>
-      <w:bookmarkEnd w:id="14"/>
-    </w:p>
-    <w:p>
-      <w:pPr>
-        <w:rPr>
-          <w:rFonts w:cstheme="minorHAnsi"/>
-          <w:szCs w:val="20"/>
-        </w:rPr>
-      </w:pPr>
-      <w:r>
-        <w:rPr>
-          <w:rFonts w:cstheme="minorHAnsi"/>
-          <w:szCs w:val="20"/>
-        </w:rPr>
-        <w:t>Käytä</w:t>
-      </w:r>
-      <w:r>
-        <w:rPr>
-          <w:rFonts w:cstheme="minorHAnsi"/>
-          <w:szCs w:val="20"/>
-        </w:rPr>
-        <w:t xml:space="preserve"> </w:t>
-      </w:r>
-      <w:r>
-        <w:rPr>
-          <w:rFonts w:cstheme="minorHAnsi"/>
-          <w:szCs w:val="20"/>
-        </w:rPr>
-        <w:t xml:space="preserve">APA 7 -viittaustyylistä nimiviittausta. </w:t>
-      </w:r>
-      <w:r>
-        <w:rPr>
-          <w:rFonts w:cstheme="minorHAnsi"/>
-          <w:szCs w:val="20"/>
-        </w:rPr>
-        <w:t xml:space="preserve">Esimerkkejä löydät kirjoitusohjeista (Tritonia, </w:t>
-      </w:r>
-      <w:proofErr w:type="spellStart"/>
-      <w:r>
-        <w:rPr>
-          <w:rFonts w:cstheme="minorHAnsi"/>
-          <w:szCs w:val="20"/>
-        </w:rPr>
-        <w:t>n.d</w:t>
-      </w:r>
-      <w:proofErr w:type="spellEnd"/>
-      <w:r>
-        <w:rPr>
-          <w:rFonts w:cstheme="minorHAnsi"/>
-          <w:szCs w:val="20"/>
-        </w:rPr>
-        <w:t>).</w:t>
-      </w:r>
-    </w:p>
-    <w:p>
-      <w:pPr>
-        <w:rPr>
-          <w:rFonts w:cstheme="minorHAnsi"/>
-          <w:szCs w:val="20"/>
-        </w:rPr>
-      </w:pPr>
-      <w:r>
-        <w:rPr>
-          <w:rFonts w:cstheme="minorHAnsi"/>
-          <w:szCs w:val="20"/>
-        </w:rPr>
-        <w:t xml:space="preserve">Jokainen lähde, johon tekstissä on viitattu, mainitaan myös lähdeluettelossa. Vastaavasti jokaisesta lähdeluettelossa mainitusta lähteestä tulee olla viittaus tekstissä. </w:t>
-      </w:r>
-    </w:p>
-    <w:p>
-      <w:pPr>
-        <w:rPr>
-          <w:rFonts w:cstheme="minorHAnsi"/>
-          <w:szCs w:val="20"/>
-        </w:rPr>
-      </w:pPr>
-      <w:r>
-        <w:rPr>
-          <w:rFonts w:cstheme="minorHAnsi"/>
-          <w:szCs w:val="20"/>
-        </w:rPr>
-        <w:t xml:space="preserve">Ota käyttöösi </w:t>
-      </w:r>
-      <w:proofErr w:type="spellStart"/>
-      <w:r>
-        <w:rPr>
-          <w:rFonts w:cstheme="minorHAnsi"/>
-          <w:szCs w:val="20"/>
-        </w:rPr>
-        <w:t>Mendeley</w:t>
-      </w:r>
-      <w:proofErr w:type="spellEnd"/>
-      <w:r>
-        <w:rPr>
-          <w:rFonts w:cstheme="minorHAnsi"/>
-          <w:szCs w:val="20"/>
-        </w:rPr>
-        <w:t xml:space="preserve"> tai </w:t>
-      </w:r>
-      <w:proofErr w:type="spellStart"/>
-      <w:r>
-        <w:rPr>
-          <w:rFonts w:cstheme="minorHAnsi"/>
-          <w:szCs w:val="20"/>
-        </w:rPr>
-        <w:t>Zotero</w:t>
-      </w:r>
-      <w:proofErr w:type="spellEnd"/>
-      <w:r>
-        <w:rPr>
-          <w:rFonts w:cstheme="minorHAnsi"/>
-          <w:szCs w:val="20"/>
-        </w:rPr>
-        <w:t xml:space="preserve"> ja kerää eri harjoitustöissä käyttämiäsi lähteitä. Niistä voi olla hyötyä opinnäytetyötä kirjoittaessasi</w:t>
-      </w:r>
-      <w:r>
-        <w:rPr>
-          <w:rFonts w:cstheme="minorHAnsi"/>
-          <w:szCs w:val="20"/>
-        </w:rPr>
-        <w:t>.</w:t>
-      </w:r>
     </w:p>
     <w:p>
       <w:pPr>
         <w:pStyle w:val="LhteetjaLiitteetotsikko"/>
       </w:pPr>
-      <w:bookmarkStart w:id="15" w:name="_Toc421090872"/>
-      <w:bookmarkStart w:id="16" w:name="_Toc185420493"/>
-      <w:bookmarkStart w:id="17" w:name="_Toc224836182"/>
-      <w:bookmarkEnd w:id="0"/>
+      <w:bookmarkStart w:id="10" w:name="_Toc421090872"/>
+      <w:bookmarkStart w:id="11" w:name="_Toc185420493"/>
+      <w:bookmarkStart w:id="12" w:name="_Toc224836182"/>
       <w:bookmarkEnd w:id="1"/>
       <w:bookmarkEnd w:id="2"/>
       <w:bookmarkEnd w:id="3"/>
+      <w:bookmarkEnd w:id="4"/>
       <w:r>
         <w:lastRenderedPageBreak/>
         <w:t>L</w:t>
@@ -2510,9 +2135,9 @@
       <w:r>
         <w:t>ähteet</w:t>
       </w:r>
-      <w:bookmarkEnd w:id="15"/>
-      <w:bookmarkEnd w:id="16"/>
-      <w:bookmarkEnd w:id="17"/>
+      <w:bookmarkEnd w:id="10"/>
+      <w:bookmarkEnd w:id="11"/>
+      <w:bookmarkEnd w:id="12"/>
       <w:r>
         <w:t xml:space="preserve"> </w:t>
       </w:r>
@@ -2571,7 +2196,7 @@
       <w:r>
         <w:t xml:space="preserve"> </w:t>
       </w:r>
-      <w:hyperlink r:id="rId12" w:history="1">
+      <w:hyperlink r:id="rId11" w:history="1">
         <w:r>
           <w:rPr>
             <w:rStyle w:val="Hyperlink"/>
@@ -2590,8 +2215,8 @@
       </w:pPr>
     </w:p>
     <w:sectPr>
-      <w:headerReference w:type="default" r:id="rId13"/>
-      <w:footerReference w:type="default" r:id="rId14"/>
+      <w:headerReference w:type="default" r:id="rId12"/>
+      <w:footerReference w:type="default" r:id="rId13"/>
       <w:pgSz w:w="11906" w:h="16838" w:code="9"/>
       <w:pgMar w:top="1701" w:right="1701" w:bottom="1701" w:left="2268" w:header="1134" w:footer="709" w:gutter="0"/>
       <w:cols w:space="708"/>
@@ -3503,7 +3128,6 @@
   <w:style w:type="character" w:default="1" w:styleId="DefaultParagraphFont">
     <w:name w:val="Default Paragraph Font"/>
     <w:uiPriority w:val="1"/>
-    <w:semiHidden/>
     <w:unhideWhenUsed/>
   </w:style>
   <w:style w:type="table" w:default="1" w:styleId="TableNormal">
@@ -4710,6 +4334,8 @@
     <w:rsid w:val="00356947"/>
     <w:rsid w:val="005A4C05"/>
     <w:rsid w:val="00953368"/>
+    <w:rsid w:val="00B9320B"/>
+    <w:rsid w:val="00C5308C"/>
     <w:rsid w:val="00CE1B4B"/>
   </w:rsids>
   <m:mathPr>

</xml_diff>

<commit_message>
SEO ja GEO optimointi ja projektiraportin tekoa
</commit_message>
<xml_diff>
--- a/Tuotekehitysraportti.docx
+++ b/Tuotekehitysraportti.docx
@@ -397,7 +397,7 @@
         </w:rPr>
         <w:fldChar w:fldCharType="separate"/>
       </w:r>
-      <w:hyperlink w:anchor="_Toc224836174" w:history="1">
+      <w:hyperlink w:anchor="_Toc225530379" w:history="1">
         <w:r>
           <w:rPr>
             <w:rStyle w:val="Hyperlink"/>
@@ -437,7 +437,7 @@
           <w:rPr>
             <w:webHidden/>
           </w:rPr>
-          <w:instrText xml:space="preserve"> PAGEREF _Toc224836174 \h </w:instrText>
+          <w:instrText xml:space="preserve"> PAGEREF _Toc225530379 \h </w:instrText>
         </w:r>
         <w:r>
           <w:rPr>
@@ -476,7 +476,7 @@
           <w14:ligatures w14:val="standardContextual"/>
         </w:rPr>
       </w:pPr>
-      <w:hyperlink w:anchor="_Toc224836175" w:history="1">
+      <w:hyperlink w:anchor="_Toc225530380" w:history="1">
         <w:r>
           <w:rPr>
             <w:rStyle w:val="Hyperlink"/>
@@ -521,7 +521,7 @@
             <w:noProof/>
             <w:webHidden/>
           </w:rPr>
-          <w:instrText xml:space="preserve"> PAGEREF _Toc224836175 \h </w:instrText>
+          <w:instrText xml:space="preserve"> PAGEREF _Toc225530380 \h </w:instrText>
         </w:r>
         <w:r>
           <w:rPr>
@@ -564,7 +564,7 @@
           <w14:ligatures w14:val="standardContextual"/>
         </w:rPr>
       </w:pPr>
-      <w:hyperlink w:anchor="_Toc224836176" w:history="1">
+      <w:hyperlink w:anchor="_Toc225530381" w:history="1">
         <w:r>
           <w:rPr>
             <w:rStyle w:val="Hyperlink"/>
@@ -588,7 +588,7 @@
             <w:rStyle w:val="Hyperlink"/>
             <w:noProof/>
           </w:rPr>
-          <w:t>Tekoälyn käyttö tässä harjoitustyössä</w:t>
+          <w:t>Tekoälyn käyttö tässä harjoitustyössä (Piita)</w:t>
         </w:r>
         <w:r>
           <w:rPr>
@@ -609,7 +609,7 @@
             <w:noProof/>
             <w:webHidden/>
           </w:rPr>
-          <w:instrText xml:space="preserve"> PAGEREF _Toc224836176 \h </w:instrText>
+          <w:instrText xml:space="preserve"> PAGEREF _Toc225530381 \h </w:instrText>
         </w:r>
         <w:r>
           <w:rPr>
@@ -652,7 +652,7 @@
           <w14:ligatures w14:val="standardContextual"/>
         </w:rPr>
       </w:pPr>
-      <w:hyperlink w:anchor="_Toc224836177" w:history="1">
+      <w:hyperlink w:anchor="_Toc225530382" w:history="1">
         <w:r>
           <w:rPr>
             <w:rStyle w:val="Hyperlink"/>
@@ -693,7 +693,7 @@
           <w:rPr>
             <w:webHidden/>
           </w:rPr>
-          <w:instrText xml:space="preserve"> PAGEREF _Toc224836177 \h </w:instrText>
+          <w:instrText xml:space="preserve"> PAGEREF _Toc225530382 \h </w:instrText>
         </w:r>
         <w:r>
           <w:rPr>
@@ -710,7 +710,7 @@
           <w:rPr>
             <w:webHidden/>
           </w:rPr>
-          <w:t>5</w:t>
+          <w:t>4</w:t>
         </w:r>
         <w:r>
           <w:rPr>
@@ -732,7 +732,7 @@
           <w14:ligatures w14:val="standardContextual"/>
         </w:rPr>
       </w:pPr>
-      <w:hyperlink w:anchor="_Toc224836178" w:history="1">
+      <w:hyperlink w:anchor="_Toc225530383" w:history="1">
         <w:r>
           <w:rPr>
             <w:rStyle w:val="Hyperlink"/>
@@ -777,7 +777,7 @@
             <w:noProof/>
             <w:webHidden/>
           </w:rPr>
-          <w:instrText xml:space="preserve"> PAGEREF _Toc224836178 \h </w:instrText>
+          <w:instrText xml:space="preserve"> PAGEREF _Toc225530383 \h </w:instrText>
         </w:r>
         <w:r>
           <w:rPr>
@@ -797,7 +797,7 @@
             <w:noProof/>
             <w:webHidden/>
           </w:rPr>
-          <w:t>5</w:t>
+          <w:t>4</w:t>
         </w:r>
         <w:r>
           <w:rPr>
@@ -820,7 +820,7 @@
           <w14:ligatures w14:val="standardContextual"/>
         </w:rPr>
       </w:pPr>
-      <w:hyperlink w:anchor="_Toc224836179" w:history="1">
+      <w:hyperlink w:anchor="_Toc225530384" w:history="1">
         <w:r>
           <w:rPr>
             <w:rStyle w:val="Hyperlink"/>
@@ -844,7 +844,7 @@
             <w:rStyle w:val="Hyperlink"/>
             <w:noProof/>
           </w:rPr>
-          <w:t>Tyylien käyttö ja sisällysluettelo</w:t>
+          <w:t>CSS Toteutus</w:t>
         </w:r>
         <w:r>
           <w:rPr>
@@ -865,7 +865,7 @@
             <w:noProof/>
             <w:webHidden/>
           </w:rPr>
-          <w:instrText xml:space="preserve"> PAGEREF _Toc224836179 \h </w:instrText>
+          <w:instrText xml:space="preserve"> PAGEREF _Toc225530384 \h </w:instrText>
         </w:r>
         <w:r>
           <w:rPr>
@@ -908,11 +908,12 @@
           <w14:ligatures w14:val="standardContextual"/>
         </w:rPr>
       </w:pPr>
-      <w:hyperlink w:anchor="_Toc224836180" w:history="1">
+      <w:hyperlink w:anchor="_Toc225530385" w:history="1">
         <w:r>
           <w:rPr>
             <w:rStyle w:val="Hyperlink"/>
             <w:noProof/>
+            <w:lang w:val="sv-SE"/>
           </w:rPr>
           <w:t>2.3</w:t>
         </w:r>
@@ -931,8 +932,9 @@
           <w:rPr>
             <w:rStyle w:val="Hyperlink"/>
             <w:noProof/>
-          </w:rPr>
-          <w:t>Kuvat, kuviot ja taulukot</w:t>
+            <w:lang w:val="sv-SE"/>
+          </w:rPr>
+          <w:t>Tyyliohje, desing system ja desing rationale</w:t>
         </w:r>
         <w:r>
           <w:rPr>
@@ -953,7 +955,7 @@
             <w:noProof/>
             <w:webHidden/>
           </w:rPr>
-          <w:instrText xml:space="preserve"> PAGEREF _Toc224836180 \h </w:instrText>
+          <w:instrText xml:space="preserve"> PAGEREF _Toc225530385 \h </w:instrText>
         </w:r>
         <w:r>
           <w:rPr>
@@ -986,7 +988,7 @@
     </w:p>
     <w:p>
       <w:pPr>
-        <w:pStyle w:val="TOC2"/>
+        <w:pStyle w:val="TOC3"/>
         <w:rPr>
           <w:rFonts w:asciiTheme="minorHAnsi" w:eastAsiaTheme="minorEastAsia" w:hAnsiTheme="minorHAnsi" w:cstheme="minorBidi"/>
           <w:noProof/>
@@ -996,13 +998,13 @@
           <w14:ligatures w14:val="standardContextual"/>
         </w:rPr>
       </w:pPr>
-      <w:hyperlink w:anchor="_Toc224836181" w:history="1">
+      <w:hyperlink w:anchor="_Toc225530386" w:history="1">
         <w:r>
           <w:rPr>
             <w:rStyle w:val="Hyperlink"/>
             <w:noProof/>
           </w:rPr>
-          <w:t>2.4</w:t>
+          <w:t>2.3.1</w:t>
         </w:r>
         <w:r>
           <w:rPr>
@@ -1020,6 +1022,270 @@
             <w:rStyle w:val="Hyperlink"/>
             <w:noProof/>
           </w:rPr>
+          <w:t>Tyyliohje (Style guide)</w:t>
+        </w:r>
+        <w:r>
+          <w:rPr>
+            <w:noProof/>
+            <w:webHidden/>
+          </w:rPr>
+          <w:tab/>
+        </w:r>
+        <w:r>
+          <w:rPr>
+            <w:noProof/>
+            <w:webHidden/>
+          </w:rPr>
+          <w:fldChar w:fldCharType="begin"/>
+        </w:r>
+        <w:r>
+          <w:rPr>
+            <w:noProof/>
+            <w:webHidden/>
+          </w:rPr>
+          <w:instrText xml:space="preserve"> PAGEREF _Toc225530386 \h </w:instrText>
+        </w:r>
+        <w:r>
+          <w:rPr>
+            <w:noProof/>
+            <w:webHidden/>
+          </w:rPr>
+        </w:r>
+        <w:r>
+          <w:rPr>
+            <w:noProof/>
+            <w:webHidden/>
+          </w:rPr>
+          <w:fldChar w:fldCharType="separate"/>
+        </w:r>
+        <w:r>
+          <w:rPr>
+            <w:noProof/>
+            <w:webHidden/>
+          </w:rPr>
+          <w:t>6</w:t>
+        </w:r>
+        <w:r>
+          <w:rPr>
+            <w:noProof/>
+            <w:webHidden/>
+          </w:rPr>
+          <w:fldChar w:fldCharType="end"/>
+        </w:r>
+      </w:hyperlink>
+    </w:p>
+    <w:p>
+      <w:pPr>
+        <w:pStyle w:val="TOC3"/>
+        <w:rPr>
+          <w:rFonts w:asciiTheme="minorHAnsi" w:eastAsiaTheme="minorEastAsia" w:hAnsiTheme="minorHAnsi" w:cstheme="minorBidi"/>
+          <w:noProof/>
+          <w:kern w:val="2"/>
+          <w:sz w:val="24"/>
+          <w:lang w:eastAsia="fi-FI"/>
+          <w14:ligatures w14:val="standardContextual"/>
+        </w:rPr>
+      </w:pPr>
+      <w:hyperlink w:anchor="_Toc225530387" w:history="1">
+        <w:r>
+          <w:rPr>
+            <w:rStyle w:val="Hyperlink"/>
+            <w:noProof/>
+          </w:rPr>
+          <w:t>2.3.2</w:t>
+        </w:r>
+        <w:r>
+          <w:rPr>
+            <w:rFonts w:asciiTheme="minorHAnsi" w:eastAsiaTheme="minorEastAsia" w:hAnsiTheme="minorHAnsi" w:cstheme="minorBidi"/>
+            <w:noProof/>
+            <w:kern w:val="2"/>
+            <w:sz w:val="24"/>
+            <w:lang w:eastAsia="fi-FI"/>
+            <w14:ligatures w14:val="standardContextual"/>
+          </w:rPr>
+          <w:tab/>
+        </w:r>
+        <w:r>
+          <w:rPr>
+            <w:rStyle w:val="Hyperlink"/>
+            <w:noProof/>
+          </w:rPr>
+          <w:t>Design system (lyhyesti)</w:t>
+        </w:r>
+        <w:r>
+          <w:rPr>
+            <w:noProof/>
+            <w:webHidden/>
+          </w:rPr>
+          <w:tab/>
+        </w:r>
+        <w:r>
+          <w:rPr>
+            <w:noProof/>
+            <w:webHidden/>
+          </w:rPr>
+          <w:fldChar w:fldCharType="begin"/>
+        </w:r>
+        <w:r>
+          <w:rPr>
+            <w:noProof/>
+            <w:webHidden/>
+          </w:rPr>
+          <w:instrText xml:space="preserve"> PAGEREF _Toc225530387 \h </w:instrText>
+        </w:r>
+        <w:r>
+          <w:rPr>
+            <w:noProof/>
+            <w:webHidden/>
+          </w:rPr>
+        </w:r>
+        <w:r>
+          <w:rPr>
+            <w:noProof/>
+            <w:webHidden/>
+          </w:rPr>
+          <w:fldChar w:fldCharType="separate"/>
+        </w:r>
+        <w:r>
+          <w:rPr>
+            <w:noProof/>
+            <w:webHidden/>
+          </w:rPr>
+          <w:t>6</w:t>
+        </w:r>
+        <w:r>
+          <w:rPr>
+            <w:noProof/>
+            <w:webHidden/>
+          </w:rPr>
+          <w:fldChar w:fldCharType="end"/>
+        </w:r>
+      </w:hyperlink>
+    </w:p>
+    <w:p>
+      <w:pPr>
+        <w:pStyle w:val="TOC3"/>
+        <w:rPr>
+          <w:rFonts w:asciiTheme="minorHAnsi" w:eastAsiaTheme="minorEastAsia" w:hAnsiTheme="minorHAnsi" w:cstheme="minorBidi"/>
+          <w:noProof/>
+          <w:kern w:val="2"/>
+          <w:sz w:val="24"/>
+          <w:lang w:eastAsia="fi-FI"/>
+          <w14:ligatures w14:val="standardContextual"/>
+        </w:rPr>
+      </w:pPr>
+      <w:hyperlink w:anchor="_Toc225530388" w:history="1">
+        <w:r>
+          <w:rPr>
+            <w:rStyle w:val="Hyperlink"/>
+            <w:noProof/>
+          </w:rPr>
+          <w:t>2.3.3</w:t>
+        </w:r>
+        <w:r>
+          <w:rPr>
+            <w:rFonts w:asciiTheme="minorHAnsi" w:eastAsiaTheme="minorEastAsia" w:hAnsiTheme="minorHAnsi" w:cstheme="minorBidi"/>
+            <w:noProof/>
+            <w:kern w:val="2"/>
+            <w:sz w:val="24"/>
+            <w:lang w:eastAsia="fi-FI"/>
+            <w14:ligatures w14:val="standardContextual"/>
+          </w:rPr>
+          <w:tab/>
+        </w:r>
+        <w:r>
+          <w:rPr>
+            <w:rStyle w:val="Hyperlink"/>
+            <w:noProof/>
+          </w:rPr>
+          <w:t>Design rationale</w:t>
+        </w:r>
+        <w:r>
+          <w:rPr>
+            <w:noProof/>
+            <w:webHidden/>
+          </w:rPr>
+          <w:tab/>
+        </w:r>
+        <w:r>
+          <w:rPr>
+            <w:noProof/>
+            <w:webHidden/>
+          </w:rPr>
+          <w:fldChar w:fldCharType="begin"/>
+        </w:r>
+        <w:r>
+          <w:rPr>
+            <w:noProof/>
+            <w:webHidden/>
+          </w:rPr>
+          <w:instrText xml:space="preserve"> PAGEREF _Toc225530388 \h </w:instrText>
+        </w:r>
+        <w:r>
+          <w:rPr>
+            <w:noProof/>
+            <w:webHidden/>
+          </w:rPr>
+        </w:r>
+        <w:r>
+          <w:rPr>
+            <w:noProof/>
+            <w:webHidden/>
+          </w:rPr>
+          <w:fldChar w:fldCharType="separate"/>
+        </w:r>
+        <w:r>
+          <w:rPr>
+            <w:noProof/>
+            <w:webHidden/>
+          </w:rPr>
+          <w:t>7</w:t>
+        </w:r>
+        <w:r>
+          <w:rPr>
+            <w:noProof/>
+            <w:webHidden/>
+          </w:rPr>
+          <w:fldChar w:fldCharType="end"/>
+        </w:r>
+      </w:hyperlink>
+    </w:p>
+    <w:p>
+      <w:pPr>
+        <w:pStyle w:val="TOC2"/>
+        <w:rPr>
+          <w:rFonts w:asciiTheme="minorHAnsi" w:eastAsiaTheme="minorEastAsia" w:hAnsiTheme="minorHAnsi" w:cstheme="minorBidi"/>
+          <w:noProof/>
+          <w:kern w:val="2"/>
+          <w:sz w:val="24"/>
+          <w:lang w:eastAsia="fi-FI"/>
+          <w14:ligatures w14:val="standardContextual"/>
+        </w:rPr>
+      </w:pPr>
+      <w:hyperlink w:anchor="_Toc225530389" w:history="1">
+        <w:r>
+          <w:rPr>
+            <w:rStyle w:val="Hyperlink"/>
+            <w:noProof/>
+          </w:rPr>
+          <w:t>2.4</w:t>
+        </w:r>
+        <w:r>
+          <w:rPr>
+            <w:rFonts w:asciiTheme="minorHAnsi" w:eastAsiaTheme="minorEastAsia" w:hAnsiTheme="minorHAnsi" w:cstheme="minorBidi"/>
+            <w:noProof/>
+            <w:kern w:val="2"/>
+            <w:sz w:val="24"/>
+            <w:lang w:eastAsia="fi-FI"/>
+            <w14:ligatures w14:val="standardContextual"/>
+          </w:rPr>
+          <w:tab/>
+        </w:r>
+        <w:r>
+          <w:rPr>
+            <w:rStyle w:val="Hyperlink"/>
+            <w:noProof/>
+          </w:rPr>
           <w:t>Lähdeviittaukset ja lähdeluettelon teko</w:t>
         </w:r>
         <w:r>
@@ -1041,7 +1307,7 @@
             <w:noProof/>
             <w:webHidden/>
           </w:rPr>
-          <w:instrText xml:space="preserve"> PAGEREF _Toc224836181 \h </w:instrText>
+          <w:instrText xml:space="preserve"> PAGEREF _Toc225530389 \h </w:instrText>
         </w:r>
         <w:r>
           <w:rPr>
@@ -1084,7 +1350,7 @@
           <w14:ligatures w14:val="standardContextual"/>
         </w:rPr>
       </w:pPr>
-      <w:hyperlink w:anchor="_Toc224836182" w:history="1">
+      <w:hyperlink w:anchor="_Toc225530390" w:history="1">
         <w:r>
           <w:rPr>
             <w:rStyle w:val="Hyperlink"/>
@@ -1107,7 +1373,7 @@
           <w:rPr>
             <w:webHidden/>
           </w:rPr>
-          <w:instrText xml:space="preserve"> PAGEREF _Toc224836182 \h </w:instrText>
+          <w:instrText xml:space="preserve"> PAGEREF _Toc225530390 \h </w:instrText>
         </w:r>
         <w:r>
           <w:rPr>
@@ -1124,7 +1390,7 @@
           <w:rPr>
             <w:webHidden/>
           </w:rPr>
-          <w:t>8</w:t>
+          <w:t>9</w:t>
         </w:r>
         <w:r>
           <w:rPr>
@@ -1169,77 +1435,47 @@
           <w:rFonts w:cstheme="minorHAnsi"/>
         </w:rPr>
       </w:pPr>
-      <w:bookmarkStart w:id="0" w:name="_Toc224836174"/>
-      <w:bookmarkStart w:id="1" w:name="_Toc164496814"/>
-      <w:bookmarkStart w:id="2" w:name="_Toc166464152"/>
-      <w:bookmarkStart w:id="3" w:name="_Toc230592239"/>
-      <w:bookmarkStart w:id="4" w:name="_Toc230592492"/>
+      <w:bookmarkStart w:id="0" w:name="_Toc164496814"/>
+      <w:bookmarkStart w:id="1" w:name="_Toc166464152"/>
+      <w:bookmarkStart w:id="2" w:name="_Toc230592239"/>
+      <w:bookmarkStart w:id="3" w:name="_Toc230592492"/>
+      <w:bookmarkStart w:id="4" w:name="_Toc225530379"/>
       <w:r>
         <w:lastRenderedPageBreak/>
         <w:t>Johdanto</w:t>
       </w:r>
-      <w:bookmarkEnd w:id="0"/>
-    </w:p>
-    <w:p>
-      <w:pPr>
-        <w:rPr>
-          <w:rFonts w:cstheme="minorHAnsi"/>
-        </w:rPr>
-      </w:pPr>
-      <w:r>
-        <w:rPr>
-          <w:rFonts w:cstheme="minorHAnsi"/>
-        </w:rPr>
-        <w:t xml:space="preserve">Tässä raportissa perehdytään seuraamaan tuotekehitysprojekti 1 etenemistä. Projektin tarkoituksen on luoda verkkosivut kuvitteelliselle </w:t>
-      </w:r>
-      <w:proofErr w:type="spellStart"/>
-      <w:r>
-        <w:rPr>
-          <w:rFonts w:cstheme="minorHAnsi"/>
-        </w:rPr>
-        <w:t>Northwind</w:t>
-      </w:r>
-      <w:proofErr w:type="spellEnd"/>
+      <w:bookmarkEnd w:id="4"/>
+    </w:p>
+    <w:p>
+      <w:pPr>
+        <w:rPr>
+          <w:rFonts w:cstheme="minorHAnsi"/>
+        </w:rPr>
+      </w:pPr>
+      <w:r>
+        <w:rPr>
+          <w:rFonts w:cstheme="minorHAnsi"/>
+        </w:rPr>
+        <w:t>Tässä raportissa perehdytään seuraamaan tuotekehitysprojekti 1 etenemistä. Projektin tarkoituksen on luoda verkkosivut kuvitteelliselle Northwind Gym &amp; Recovery kuntosali/palautumiskeskus kompleksille.</w:t>
+      </w:r>
       <w:r>
         <w:rPr>
           <w:rFonts w:cstheme="minorHAnsi"/>
         </w:rPr>
         <w:t xml:space="preserve"> </w:t>
       </w:r>
-      <w:proofErr w:type="spellStart"/>
-      <w:r>
-        <w:rPr>
-          <w:rFonts w:cstheme="minorHAnsi"/>
-        </w:rPr>
-        <w:t>Gym</w:t>
-      </w:r>
-      <w:proofErr w:type="spellEnd"/>
-      <w:r>
-        <w:rPr>
-          <w:rFonts w:cstheme="minorHAnsi"/>
-        </w:rPr>
-        <w:t xml:space="preserve"> &amp; </w:t>
-      </w:r>
-      <w:proofErr w:type="spellStart"/>
-      <w:r>
-        <w:rPr>
-          <w:rFonts w:cstheme="minorHAnsi"/>
-        </w:rPr>
-        <w:t>Recovery</w:t>
-      </w:r>
-      <w:proofErr w:type="spellEnd"/>
-      <w:r>
-        <w:rPr>
-          <w:rFonts w:cstheme="minorHAnsi"/>
-        </w:rPr>
-        <w:t xml:space="preserve"> kuntosali/palautumiskeskus kompleksille.</w:t>
+      <w:r>
+        <w:rPr>
+          <w:rFonts w:cstheme="minorHAnsi"/>
+        </w:rPr>
+        <w:t>Kohdeyleisönä sivutolle ovat aikuiset jotka harrastavat aktiivisesti liikuntaa.</w:t>
       </w:r>
     </w:p>
     <w:p>
       <w:pPr>
         <w:pStyle w:val="Heading2"/>
       </w:pPr>
-      <w:bookmarkStart w:id="5" w:name="_Toc224836175"/>
+      <w:bookmarkStart w:id="5" w:name="_Toc225530380"/>
       <w:r>
         <w:t>Tekoälyn käyttö tässä harjoitustyössä</w:t>
       </w:r>
@@ -1258,123 +1494,37 @@
         <w:rPr>
           <w:rFonts w:cstheme="minorHAnsi"/>
         </w:rPr>
-        <w:t xml:space="preserve">HTML koodin tekovaiheessa käytin tekoälyn apua tarkastuksessa, että tekemäni HTML on varmasti </w:t>
-      </w:r>
-      <w:proofErr w:type="spellStart"/>
-      <w:r>
-        <w:rPr>
-          <w:rFonts w:cstheme="minorHAnsi"/>
-        </w:rPr>
-        <w:t>wireframen</w:t>
-      </w:r>
-      <w:proofErr w:type="spellEnd"/>
-      <w:r>
-        <w:rPr>
-          <w:rFonts w:cstheme="minorHAnsi"/>
-        </w:rPr>
-        <w:t xml:space="preserve"> mukainen, sain muutamia korjauskehotuksia tarkastuksen yhteydessä mutta nämä </w:t>
-      </w:r>
-      <w:proofErr w:type="spellStart"/>
-      <w:r>
-        <w:rPr>
-          <w:rFonts w:cstheme="minorHAnsi"/>
-        </w:rPr>
-        <w:t>korjauskehoitukset</w:t>
-      </w:r>
-      <w:proofErr w:type="spellEnd"/>
-      <w:r>
-        <w:rPr>
-          <w:rFonts w:cstheme="minorHAnsi"/>
-        </w:rPr>
-        <w:t xml:space="preserve"> sotivat vain </w:t>
-      </w:r>
-      <w:proofErr w:type="spellStart"/>
-      <w:r>
-        <w:rPr>
-          <w:rFonts w:cstheme="minorHAnsi"/>
-        </w:rPr>
-        <w:t>wireframen</w:t>
-      </w:r>
-      <w:proofErr w:type="spellEnd"/>
-      <w:r>
-        <w:rPr>
-          <w:rFonts w:cstheme="minorHAnsi"/>
-        </w:rPr>
-        <w:t xml:space="preserve"> kanssa keskenään. </w:t>
-      </w:r>
-      <w:proofErr w:type="spellStart"/>
-      <w:r>
-        <w:rPr>
-          <w:rFonts w:cstheme="minorHAnsi"/>
-        </w:rPr>
-        <w:t>Gemini</w:t>
-      </w:r>
-      <w:proofErr w:type="spellEnd"/>
-      <w:r>
-        <w:rPr>
-          <w:rFonts w:cstheme="minorHAnsi"/>
-        </w:rPr>
-        <w:t xml:space="preserve"> siis ehdotti, että navigaatio palkki olisi hyvä olla </w:t>
-      </w:r>
-      <w:proofErr w:type="spellStart"/>
-      <w:r>
-        <w:rPr>
-          <w:rFonts w:cstheme="minorHAnsi"/>
-        </w:rPr>
-        <w:t>hero</w:t>
-      </w:r>
-      <w:proofErr w:type="spellEnd"/>
-      <w:r>
-        <w:rPr>
-          <w:rFonts w:cstheme="minorHAnsi"/>
-        </w:rPr>
-        <w:t xml:space="preserve"> kuvan yläpuolella.</w:t>
-      </w:r>
-      <w:r>
-        <w:rPr>
-          <w:rFonts w:cstheme="minorHAnsi"/>
-        </w:rPr>
-        <w:t xml:space="preserve"> Pysyin kuitenkin alkuperäisessä suunnitelmassa ja pidin </w:t>
-      </w:r>
-      <w:proofErr w:type="spellStart"/>
-      <w:r>
-        <w:rPr>
-          <w:rFonts w:cstheme="minorHAnsi"/>
-        </w:rPr>
-        <w:t>nav</w:t>
-      </w:r>
-      <w:proofErr w:type="spellEnd"/>
-      <w:r>
-        <w:rPr>
-          <w:rFonts w:cstheme="minorHAnsi"/>
-        </w:rPr>
-        <w:t>.</w:t>
+        <w:t>HTML koodin tekovaiheessa käytin tekoälyn apua tarkastuksessa, että tekemäni HTML on varmasti wireframen mukainen, sain muutamia korjauskehotuksia tarkastuksen yhteydessä mutta nämä korjauskehoitukset sotivat vain wireframen kanssa keskenään. Gemini siis ehdotti, että navigaatio palkki olisi hyvä olla hero kuvan yläpuolella.</w:t>
+      </w:r>
+      <w:r>
+        <w:rPr>
+          <w:rFonts w:cstheme="minorHAnsi"/>
+        </w:rPr>
+        <w:t xml:space="preserve"> Pysyin kuitenkin alkuperäisessä suunnitelmassa ja pidin nav.</w:t>
+      </w:r>
+      <w:r>
+        <w:rPr>
+          <w:rFonts w:cstheme="minorHAnsi"/>
+        </w:rPr>
+        <w:t xml:space="preserve"> AI:n apua käytin myös GEO optimoinnissa lähinnä kysymyksen asetteluun, että onko se järkevämpi tehdä englanniksi vai suomeksi. Sain ehdotelman englannin kielestä niin tein sen englanniksi. </w:t>
       </w:r>
     </w:p>
     <w:p>
       <w:pPr>
         <w:pStyle w:val="Heading2"/>
       </w:pPr>
-      <w:bookmarkStart w:id="6" w:name="_Toc224836176"/>
+      <w:bookmarkStart w:id="6" w:name="_Toc225530381"/>
       <w:r>
         <w:t>Tekoälyn käyttö tässä harjoitustyössä</w:t>
       </w:r>
+      <w:r>
+        <w:t xml:space="preserve"> (Piita)</w:t>
+      </w:r>
       <w:bookmarkEnd w:id="6"/>
-      <w:r>
-        <w:t xml:space="preserve"> (Piita)</w:t>
-      </w:r>
-    </w:p>
-    <w:p>
-      <w:r>
-        <w:t xml:space="preserve">Hyödynsin tekoälyä CSS-tyylien kehittämisessä erityisesti ongelmatilanteiden ratkaisemiseen ja ulkoasun viimeistelyyn. Tekoäly auttoi esimerkiksi </w:t>
-      </w:r>
-      <w:proofErr w:type="spellStart"/>
-      <w:r>
-        <w:t>responsiivisuuden</w:t>
-      </w:r>
-      <w:proofErr w:type="spellEnd"/>
-      <w:r>
-        <w:t xml:space="preserve"> toteutuksessa, elementtien keskittämisessä sekä korttirakenteen yhtenäistämisessä. Lopulliset ratkaisut valitsin ja muokkasin itse, jotta ne sopivat projektin kokonaisuuteen.</w:t>
+    </w:p>
+    <w:p>
+      <w:r>
+        <w:t>Hyödynsin tekoälyä CSS-tyylien kehittämisessä erityisesti ongelmatilanteiden ratkaisemiseen ja ulkoasun viimeistelyyn. Tekoäly auttoi esimerkiksi responsiivisuuden toteutuksessa, elementtien keskittämisessä sekä korttirakenteen yhtenäistämisessä. Lopulliset ratkaisut valitsin ja muokkasin itse, jotta ne sopivat projektin kokonaisuuteen.</w:t>
       </w:r>
     </w:p>
     <w:p>
@@ -1384,7 +1534,7 @@
           <w:rFonts w:cstheme="minorHAnsi"/>
         </w:rPr>
       </w:pPr>
-      <w:bookmarkStart w:id="7" w:name="_Toc224836177"/>
+      <w:bookmarkStart w:id="7" w:name="_Toc225530382"/>
       <w:r>
         <w:rPr>
           <w:rFonts w:cstheme="minorHAnsi"/>
@@ -1398,7 +1548,7 @@
       <w:pPr>
         <w:pStyle w:val="Heading2"/>
       </w:pPr>
-      <w:bookmarkStart w:id="8" w:name="_Toc224836178"/>
+      <w:bookmarkStart w:id="8" w:name="_Toc225530383"/>
       <w:r>
         <w:t>HTML Toteutus</w:t>
       </w:r>
@@ -1426,21 +1576,7 @@
         <w:rPr>
           <w:rFonts w:cstheme="minorHAnsi"/>
         </w:rPr>
-        <w:t xml:space="preserve"> kun </w:t>
-      </w:r>
-      <w:proofErr w:type="spellStart"/>
-      <w:r>
-        <w:rPr>
-          <w:rFonts w:cstheme="minorHAnsi"/>
-        </w:rPr>
-        <w:t>wireframe</w:t>
-      </w:r>
-      <w:proofErr w:type="spellEnd"/>
-      <w:r>
-        <w:rPr>
-          <w:rFonts w:cstheme="minorHAnsi"/>
-        </w:rPr>
-        <w:t xml:space="preserve"> valmistui, kokonaisuudessaan aikaa kului noin 12</w:t>
+        <w:t xml:space="preserve"> kun wireframe valmistui, kokonaisuudessaan aikaa kului noin 12</w:t>
       </w:r>
       <w:r>
         <w:rPr>
@@ -1619,91 +1755,7 @@
           <w:rFonts w:cstheme="minorHAnsi"/>
         </w:rPr>
         <w:lastRenderedPageBreak/>
-        <w:t xml:space="preserve">24.3.2026 käytiin </w:t>
-      </w:r>
-      <w:proofErr w:type="spellStart"/>
-      <w:r>
-        <w:rPr>
-          <w:rFonts w:cstheme="minorHAnsi"/>
-        </w:rPr>
-        <w:t>scrum</w:t>
-      </w:r>
-      <w:proofErr w:type="spellEnd"/>
-      <w:r>
-        <w:rPr>
-          <w:rFonts w:cstheme="minorHAnsi"/>
-        </w:rPr>
-        <w:t xml:space="preserve"> palaveri ja katsaus verkkosivustoista, tämän perusteella päivitin NAV palkin siten että palkki pysyy koko ajan samanlaisena. Alkuun palkki oli siten että sieltä hävisi aina se millä sivulla käyttäjä on ja tilalle ilmestyi ”Etusivu” painike. Päivitin lisäksi </w:t>
-      </w:r>
-      <w:proofErr w:type="spellStart"/>
-      <w:r>
-        <w:rPr>
-          <w:rFonts w:cstheme="minorHAnsi"/>
-        </w:rPr>
-        <w:t>hero</w:t>
-      </w:r>
-      <w:proofErr w:type="spellEnd"/>
-      <w:r>
-        <w:rPr>
-          <w:rFonts w:cstheme="minorHAnsi"/>
-        </w:rPr>
-        <w:t xml:space="preserve"> kuvan kutsuvammaksi ja enemmän </w:t>
-      </w:r>
-      <w:proofErr w:type="spellStart"/>
-      <w:r>
-        <w:rPr>
-          <w:rFonts w:cstheme="minorHAnsi"/>
-        </w:rPr>
-        <w:t>wireframen</w:t>
-      </w:r>
-      <w:proofErr w:type="spellEnd"/>
-      <w:r>
-        <w:rPr>
-          <w:rFonts w:cstheme="minorHAnsi"/>
-        </w:rPr>
-        <w:t xml:space="preserve"> mukaiseksi. Jos oikeaa nettisivua </w:t>
-      </w:r>
-      <w:proofErr w:type="gramStart"/>
-      <w:r>
-        <w:rPr>
-          <w:rFonts w:cstheme="minorHAnsi"/>
-        </w:rPr>
-        <w:t>tekisin niin panostaisin</w:t>
-      </w:r>
-      <w:proofErr w:type="gramEnd"/>
-      <w:r>
-        <w:rPr>
-          <w:rFonts w:cstheme="minorHAnsi"/>
-        </w:rPr>
-        <w:t xml:space="preserve"> tähän </w:t>
-      </w:r>
-      <w:proofErr w:type="spellStart"/>
-      <w:r>
-        <w:rPr>
-          <w:rFonts w:cstheme="minorHAnsi"/>
-        </w:rPr>
-        <w:t>hero</w:t>
-      </w:r>
-      <w:proofErr w:type="spellEnd"/>
-      <w:r>
-        <w:rPr>
-          <w:rFonts w:cstheme="minorHAnsi"/>
-        </w:rPr>
-        <w:t xml:space="preserve"> kuvan muokkaukseen varmasti enemmän. Kuva alla muokatusta </w:t>
-      </w:r>
-      <w:proofErr w:type="spellStart"/>
-      <w:r>
-        <w:rPr>
-          <w:rFonts w:cstheme="minorHAnsi"/>
-        </w:rPr>
-        <w:t>hero</w:t>
-      </w:r>
-      <w:proofErr w:type="spellEnd"/>
-      <w:r>
-        <w:rPr>
-          <w:rFonts w:cstheme="minorHAnsi"/>
-        </w:rPr>
-        <w:t xml:space="preserve"> kuvasta. </w:t>
+        <w:t xml:space="preserve">24.3.2026 käytiin scrum palaveri ja katsaus verkkosivustoista, tämän perusteella päivitin NAV palkin siten että palkki pysyy koko ajan samanlaisena. Alkuun palkki oli siten että sieltä hävisi aina se millä sivulla käyttäjä on ja tilalle ilmestyi ”Etusivu” painike. Päivitin lisäksi hero kuvan kutsuvammaksi ja enemmän wireframen mukaiseksi. Jos oikeaa nettisivua tekisin niin panostaisin tähän hero kuvan muokkaukseen varmasti enemmän. Kuva alla muokatusta hero kuvasta. </w:t>
       </w:r>
     </w:p>
     <w:p>
@@ -1756,86 +1808,58 @@
     </w:p>
     <w:p>
       <w:pPr>
+        <w:rPr>
+          <w:rFonts w:cstheme="minorHAnsi"/>
+        </w:rPr>
+      </w:pPr>
+      <w:r>
+        <w:rPr>
+          <w:rFonts w:cstheme="minorHAnsi"/>
+        </w:rPr>
+        <w:t>27.3.2026. Scrum palaverissa käytiin tuotekehitysprojektia lävitse, tähän mennessä projekti sivustolla 1 on edennyt mallikkaasti. Tänään päivitin hero kuvan vielä paremmaksi ja suoritin GEO optimoinnin sivutolle. Käytin GEO optimoinnissa AI:n apuja ja sain ehdotuksen laittaa siihen myös koordinaatit. Healthclub tyyppi on tarkempi kuin yleinen Local business. Tämä ilmeisesti auttaa näyttämään salin tiedot oikein. Contact sivulle tehty Schema.org ”contactpage” merkkinä jos tämä olisi oikea yritys niin se kertoisi googlelle joka kertoo suoraan että tämä on se paikka mistä löytyy viralliset tiedot ja keneen ottaa yhteyttä.</w:t>
+      </w:r>
+      <w:r>
+        <w:rPr>
+          <w:rFonts w:cstheme="minorHAnsi"/>
+        </w:rPr>
+        <w:t xml:space="preserve"> Jäsenyydet sivulle valikoitui ItemList-skeema joka kertoo hakukoneelle että sivu sisältää listan tuotteista ja palveluista. Tämä voi auttaa eri jäsenyysvaihtoehdot suoraan hakutuloksiin. </w:t>
+      </w:r>
+    </w:p>
+    <w:p>
+      <w:pPr>
         <w:pStyle w:val="Heading2"/>
       </w:pPr>
-      <w:r>
+      <w:bookmarkStart w:id="9" w:name="_Toc225530384"/>
+      <w:r>
+        <w:lastRenderedPageBreak/>
         <w:t>CSS Toteutus</w:t>
       </w:r>
-    </w:p>
-    <w:p>
-      <w:pPr>
-        <w:rPr>
-          <w:rFonts w:cstheme="minorHAnsi"/>
-        </w:rPr>
-      </w:pPr>
-      <w:r>
-        <w:rPr>
-          <w:rFonts w:cstheme="minorHAnsi"/>
-        </w:rPr>
-        <w:t xml:space="preserve">Sivuston ulkoasu on toteutettu CSS:n avulla hyödyntäen </w:t>
-      </w:r>
-      <w:proofErr w:type="spellStart"/>
-      <w:r>
-        <w:rPr>
-          <w:rFonts w:cstheme="minorHAnsi"/>
-        </w:rPr>
-        <w:t>flexbox</w:t>
-      </w:r>
-      <w:proofErr w:type="spellEnd"/>
-      <w:r>
-        <w:rPr>
-          <w:rFonts w:cstheme="minorHAnsi"/>
-        </w:rPr>
-        <w:t xml:space="preserve">-layoutia, joka mahdollistaa elementtien joustavan asettelun eri näytöillä. Värit on </w:t>
-      </w:r>
-      <w:proofErr w:type="gramStart"/>
-      <w:r>
-        <w:rPr>
-          <w:rFonts w:cstheme="minorHAnsi"/>
-        </w:rPr>
-        <w:t>määritelty :</w:t>
-      </w:r>
-      <w:proofErr w:type="spellStart"/>
-      <w:r>
-        <w:rPr>
-          <w:rFonts w:cstheme="minorHAnsi"/>
-        </w:rPr>
-        <w:t>root</w:t>
-      </w:r>
-      <w:proofErr w:type="spellEnd"/>
-      <w:proofErr w:type="gramEnd"/>
-      <w:r>
-        <w:rPr>
-          <w:rFonts w:cstheme="minorHAnsi"/>
-        </w:rPr>
-        <w:t>-muuttujilla, mikä helpottaa tyylien hallintaa ja yhtenäisyyttä.</w:t>
-      </w:r>
-    </w:p>
-    <w:p>
-      <w:pPr>
-        <w:rPr>
-          <w:rFonts w:cstheme="minorHAnsi"/>
-        </w:rPr>
-      </w:pPr>
-      <w:r>
-        <w:rPr>
-          <w:rFonts w:cstheme="minorHAnsi"/>
-        </w:rPr>
-        <w:t xml:space="preserve">Käyttöliittymä on rakennettu uudelleenkäytettävistä komponenteista, kuten korteista ja palvelubokseista, joille on määritelty yhteiset tyylit kuten varjostus ja pyöristetyt kulmat. Responsiivisuus on toteutettu media </w:t>
-      </w:r>
-      <w:proofErr w:type="spellStart"/>
-      <w:r>
-        <w:rPr>
-          <w:rFonts w:cstheme="minorHAnsi"/>
-        </w:rPr>
-        <w:t>queryjen</w:t>
-      </w:r>
-      <w:proofErr w:type="spellEnd"/>
-      <w:r>
-        <w:rPr>
-          <w:rFonts w:cstheme="minorHAnsi"/>
-        </w:rPr>
-        <w:t xml:space="preserve"> avulla, jolloin sivu mukautuu mobiililaitteille ja sisältö asettuu selkeästi allekkain.</w:t>
+      <w:bookmarkEnd w:id="9"/>
+    </w:p>
+    <w:p>
+      <w:pPr>
+        <w:rPr>
+          <w:rFonts w:cstheme="minorHAnsi"/>
+        </w:rPr>
+      </w:pPr>
+      <w:r>
+        <w:rPr>
+          <w:rFonts w:cstheme="minorHAnsi"/>
+        </w:rPr>
+        <w:t>Sivuston ulkoasu on toteutettu CSS:n avulla hyödyntäen flexbox-layoutia, joka mahdollistaa elementtien joustavan asettelun eri näytöillä. Värit on määritelty :root-muuttujilla, mikä helpottaa tyylien hallintaa ja yhtenäisyyttä.</w:t>
+      </w:r>
+    </w:p>
+    <w:p>
+      <w:pPr>
+        <w:rPr>
+          <w:rFonts w:cstheme="minorHAnsi"/>
+        </w:rPr>
+      </w:pPr>
+      <w:r>
+        <w:rPr>
+          <w:rFonts w:cstheme="minorHAnsi"/>
+        </w:rPr>
+        <w:t>Käyttöliittymä on rakennettu uudelleenkäytettävistä komponenteista, kuten korteista ja palvelubokseista, joille on määritelty yhteiset tyylit kuten varjostus ja pyöristetyt kulmat. Responsiivisuus on toteutettu media queryjen avulla, jolloin sivu mukautuu mobiililaitteille ja sisältö asettuu selkeästi allekkain.</w:t>
       </w:r>
     </w:p>
     <w:p>
@@ -1845,386 +1869,204 @@
           <w:lang w:val="sv-SE"/>
         </w:rPr>
       </w:pPr>
-      <w:proofErr w:type="spellStart"/>
+      <w:bookmarkStart w:id="10" w:name="_Toc225530385"/>
       <w:r>
         <w:rPr>
           <w:lang w:val="sv-SE"/>
         </w:rPr>
+        <w:t>Tyyliohje, desing system ja desing rationale</w:t>
+      </w:r>
+      <w:bookmarkEnd w:id="10"/>
+      <w:r>
+        <w:rPr>
+          <w:lang w:val="sv-SE"/>
+        </w:rPr>
+        <w:t xml:space="preserve"> </w:t>
+      </w:r>
+    </w:p>
+    <w:p>
+      <w:pPr>
+        <w:pStyle w:val="Heading3"/>
+      </w:pPr>
+      <w:bookmarkStart w:id="11" w:name="_Toc225530386"/>
+      <w:r>
+        <w:t>Tyyliohje (Style guide)</w:t>
+      </w:r>
+      <w:bookmarkEnd w:id="11"/>
+    </w:p>
+    <w:p>
+      <w:r>
+        <w:t>Sivuston visuaalinen ilme perustuu raikkaaseen ja selkeään siniseen värimaailmaan, joka tukee hyvin liikunta- ja hyvinvointiteemaa. Päävärit ovat vaaleansininen (#a3cbe1), sininen (#67ace0), valkoinen (#fefefe) ja musta (#111111). Värit luovat kontrastia ja tekevät sisällöstä helposti luettavaa.</w:t>
+      </w:r>
+    </w:p>
+    <w:p>
+      <w:r>
+        <w:t>Fonttina käytetään selkeää sans-serif -fonttia (Arial), joka on helppolukuinen eri laitteilla. Otsikot, leipäteksti ja painikkeet on pidetty yksinkertaisina ja yhtenäisinä koko sivuston läpi.</w:t>
+      </w:r>
+    </w:p>
+    <w:p>
+      <w:r>
+        <w:t>Painikkeet ovat pyöristettyjä ja kontrastivärisiä, jotta ne erottuvat selkeästi ja ohjaavat käyttäjää toimintaan. Linkeissä käytetään hover-efektejä (alleviivaus), jotka parantavat käytettävyyttä.</w:t>
+      </w:r>
+    </w:p>
+    <w:p>
+      <w:pPr>
+        <w:pStyle w:val="Heading3"/>
+      </w:pPr>
+      <w:bookmarkStart w:id="12" w:name="_Toc225530387"/>
+      <w:r>
+        <w:t>Design system (lyhyesti)</w:t>
+      </w:r>
+      <w:bookmarkEnd w:id="12"/>
+    </w:p>
+    <w:p>
+      <w:r>
+        <w:t>Sivusto on rakennettu modulaarisesti käyttäen toistuvia komponentteja, kuten kortteja (card), palvelubokseja ja grid-rakenteita. Tämä tekee käyttöliittymästä yhtenäisen ja helposti laajennettavan.</w:t>
+      </w:r>
+    </w:p>
+    <w:p>
+      <w:r>
         <w:lastRenderedPageBreak/>
-        <w:t>Tyyliohje</w:t>
-      </w:r>
-      <w:proofErr w:type="spellEnd"/>
-      <w:r>
-        <w:rPr>
-          <w:lang w:val="sv-SE"/>
-        </w:rPr>
-        <w:t xml:space="preserve">, </w:t>
-      </w:r>
-      <w:proofErr w:type="spellStart"/>
-      <w:r>
-        <w:rPr>
-          <w:lang w:val="sv-SE"/>
-        </w:rPr>
-        <w:t>desing</w:t>
-      </w:r>
-      <w:proofErr w:type="spellEnd"/>
-      <w:r>
-        <w:rPr>
-          <w:lang w:val="sv-SE"/>
-        </w:rPr>
-        <w:t xml:space="preserve"> system ja </w:t>
-      </w:r>
-      <w:proofErr w:type="spellStart"/>
-      <w:r>
-        <w:rPr>
-          <w:lang w:val="sv-SE"/>
-        </w:rPr>
-        <w:t>desing</w:t>
-      </w:r>
-      <w:proofErr w:type="spellEnd"/>
-      <w:r>
-        <w:rPr>
-          <w:lang w:val="sv-SE"/>
+        <w:t>Layout perustuu pääasiassa flexboxiin, jonka avulla sisältö mukautuu eri näytön kokoihin. Kortit ja sisältöelementit noudattavat samaa rakennetta: taustaväri, varjostus ja pyöristetyt kulmat.</w:t>
+      </w:r>
+    </w:p>
+    <w:p>
+      <w:r>
+        <w:t>Responsiivisuus on toteutettu media queryjen avulla, jolloin sivusto toimii sekä mobiililaitteilla että suuremmilla näytöillä. Mobiilissa sisältö asettuu allekkain ja pysyy helposti luettavana.</w:t>
+      </w:r>
+    </w:p>
+    <w:p>
+      <w:pPr>
+        <w:pStyle w:val="Heading3"/>
+      </w:pPr>
+      <w:bookmarkStart w:id="13" w:name="_Toc225530388"/>
+      <w:r>
+        <w:t>Design rationale</w:t>
+      </w:r>
+      <w:bookmarkEnd w:id="13"/>
+    </w:p>
+    <w:p>
+      <w:r>
+        <w:t>1. Väriteeman valinta</w:t>
+      </w:r>
+    </w:p>
+    <w:p>
+      <w:r>
+        <w:t>Valitsimme sinisen värimaailman, koska se viestii luotettavuutta, energiaa ja hyvinvointia. Värit sopivat hyvin kuntosali- ja liikuntaympäristöön.</w:t>
+      </w:r>
+    </w:p>
+    <w:p>
+      <w:r>
+        <w:t>2. Korttipohjainen rakenne</w:t>
+      </w:r>
+    </w:p>
+    <w:p>
+      <w:r>
+        <w:t>Käytimme korttipohjaista layoutia, koska se tekee sisällöstä selkeää ja helposti hahmotettavaa. Kortit auttavat jakamaan informaation loogisiin osiin ja toimivat hyvin myös mobiilissa.</w:t>
+      </w:r>
+    </w:p>
+    <w:p>
+      <w:r>
+        <w:t>3. Keskitetty sisältö ja tyhjä tila</w:t>
+      </w:r>
+    </w:p>
+    <w:p>
+      <w:r>
+        <w:t>Sisältö on keskitetty ja reunoihin jätettiin tyhjää tilaa. Tämä tekee sivusta visuaalisesti selkeämmän ja helpommin luettavan.</w:t>
+      </w:r>
+    </w:p>
+    <w:p>
+      <w:r>
+        <w:t>4. Interaktiiviset elementit</w:t>
+      </w:r>
+    </w:p>
+    <w:p>
+      <w:r>
+        <w:t>Lisäsimme hover-efektejä painikkeisiin ja linkkeihin, jotta käyttäjä saa visuaalista palautetta. Tämä tekee käyttöliittymästä intuitiivisemman ja miellyttävämmän käyttää.</w:t>
+      </w:r>
+    </w:p>
+    <w:p/>
+    <w:p>
+      <w:pPr>
+        <w:pStyle w:val="Heading2"/>
+      </w:pPr>
+      <w:bookmarkStart w:id="14" w:name="_Toc225530389"/>
+      <w:r>
+        <w:lastRenderedPageBreak/>
+        <w:t>Lähdeviittaukset ja lähdeluettelon teko</w:t>
+      </w:r>
+      <w:bookmarkEnd w:id="14"/>
+    </w:p>
+    <w:p>
+      <w:pPr>
+        <w:rPr>
+          <w:rFonts w:cstheme="minorHAnsi"/>
+          <w:szCs w:val="20"/>
+        </w:rPr>
+      </w:pPr>
+      <w:r>
+        <w:rPr>
+          <w:rFonts w:cstheme="minorHAnsi"/>
+          <w:szCs w:val="20"/>
+        </w:rPr>
+        <w:t>Käytä</w:t>
+      </w:r>
+      <w:r>
+        <w:rPr>
+          <w:rFonts w:cstheme="minorHAnsi"/>
+          <w:szCs w:val="20"/>
         </w:rPr>
         <w:t xml:space="preserve"> </w:t>
       </w:r>
-      <w:proofErr w:type="spellStart"/>
-      <w:r>
-        <w:rPr>
-          <w:lang w:val="sv-SE"/>
-        </w:rPr>
-        <w:t>rationale</w:t>
-      </w:r>
-      <w:proofErr w:type="spellEnd"/>
-      <w:r>
-        <w:rPr>
-          <w:lang w:val="sv-SE"/>
-        </w:rPr>
-        <w:t xml:space="preserve"> </w:t>
-      </w:r>
-    </w:p>
-    <w:p>
-      <w:pPr>
-        <w:pStyle w:val="Heading3"/>
-      </w:pPr>
-      <w:r>
-        <w:t xml:space="preserve">Tyyliohje (Style </w:t>
-      </w:r>
-      <w:proofErr w:type="spellStart"/>
-      <w:r>
-        <w:t>guide</w:t>
-      </w:r>
-      <w:proofErr w:type="spellEnd"/>
-      <w:r>
-        <w:t>)</w:t>
-      </w:r>
-    </w:p>
-    <w:p>
-      <w:r>
-        <w:t>Sivuston visuaalinen ilme perustuu raikkaaseen ja selkeään siniseen värimaailmaan, joka tukee hyvin liikunta- ja hyvinvointiteemaa. Päävärit ovat vaaleansininen (#a3cbe1), sininen (#67ace0), valkoinen (#fefefe) ja musta (#111111). Värit luovat kontrastia ja tekevät sisällöstä helposti luettavaa.</w:t>
-      </w:r>
-    </w:p>
-    <w:p>
-      <w:r>
-        <w:t xml:space="preserve">Fonttina käytetään selkeää </w:t>
-      </w:r>
-      <w:proofErr w:type="spellStart"/>
-      <w:proofErr w:type="gramStart"/>
-      <w:r>
-        <w:t>sans-serif</w:t>
-      </w:r>
-      <w:proofErr w:type="spellEnd"/>
-      <w:r>
-        <w:t xml:space="preserve"> -fonttia</w:t>
-      </w:r>
-      <w:proofErr w:type="gramEnd"/>
-      <w:r>
-        <w:t xml:space="preserve"> (</w:t>
-      </w:r>
-      <w:proofErr w:type="spellStart"/>
-      <w:r>
-        <w:t>Arial</w:t>
-      </w:r>
-      <w:proofErr w:type="spellEnd"/>
-      <w:r>
-        <w:t>), joka on helppolukuinen eri laitteilla. Otsikot, leipäteksti ja painikkeet on pidetty yksinkertaisina ja yhtenäisinä koko sivuston läpi.</w:t>
-      </w:r>
-    </w:p>
-    <w:p>
-      <w:r>
-        <w:t xml:space="preserve">Painikkeet ovat pyöristettyjä ja kontrastivärisiä, jotta ne erottuvat selkeästi ja ohjaavat käyttäjää toimintaan. Linkeissä käytetään </w:t>
-      </w:r>
-      <w:proofErr w:type="spellStart"/>
-      <w:r>
-        <w:t>hover</w:t>
-      </w:r>
-      <w:proofErr w:type="spellEnd"/>
-      <w:r>
-        <w:t>-efektejä (alleviivaus), jotka parantavat käytettävyyttä.</w:t>
-      </w:r>
-    </w:p>
-    <w:p>
-      <w:pPr>
-        <w:pStyle w:val="Heading3"/>
-      </w:pPr>
-      <w:r>
-        <w:t xml:space="preserve">Design </w:t>
-      </w:r>
-      <w:proofErr w:type="spellStart"/>
-      <w:r>
-        <w:t>system</w:t>
-      </w:r>
-      <w:proofErr w:type="spellEnd"/>
-      <w:r>
-        <w:t xml:space="preserve"> (lyhyesti)</w:t>
-      </w:r>
-    </w:p>
-    <w:p>
-      <w:r>
-        <w:t>Sivusto on rakennettu modulaarisesti käyttäen toistuvia komponentteja, kuten kortteja (</w:t>
-      </w:r>
-      <w:proofErr w:type="spellStart"/>
-      <w:r>
-        <w:t>card</w:t>
-      </w:r>
-      <w:proofErr w:type="spellEnd"/>
-      <w:r>
-        <w:t xml:space="preserve">), palvelubokseja ja </w:t>
-      </w:r>
-      <w:proofErr w:type="spellStart"/>
-      <w:r>
-        <w:t>grid</w:t>
-      </w:r>
-      <w:proofErr w:type="spellEnd"/>
-      <w:r>
-        <w:t>-rakenteita. Tämä tekee käyttöliittymästä yhtenäisen ja helposti laajennettavan.</w:t>
-      </w:r>
-    </w:p>
-    <w:p>
-      <w:r>
-        <w:t xml:space="preserve">Layout perustuu pääasiassa </w:t>
-      </w:r>
-      <w:proofErr w:type="spellStart"/>
-      <w:r>
-        <w:t>flexboxiin</w:t>
-      </w:r>
-      <w:proofErr w:type="spellEnd"/>
-      <w:r>
-        <w:t>, jonka avulla sisältö mukautuu eri näytön kokoihin. Kortit ja sisältöelementit noudattavat samaa rakennetta: taustaväri, varjostus ja pyöristetyt kulmat.</w:t>
-      </w:r>
-    </w:p>
-    <w:p>
-      <w:r>
-        <w:t xml:space="preserve">Responsiivisuus on toteutettu media </w:t>
-      </w:r>
-      <w:proofErr w:type="spellStart"/>
-      <w:r>
-        <w:t>queryjen</w:t>
-      </w:r>
-      <w:proofErr w:type="spellEnd"/>
-      <w:r>
-        <w:t xml:space="preserve"> avulla, jolloin sivusto toimii sekä mobiililaitteilla että suuremmilla näytöillä. </w:t>
-      </w:r>
-      <w:proofErr w:type="gramStart"/>
-      <w:r>
-        <w:t>Mobiilissa</w:t>
-      </w:r>
-      <w:proofErr w:type="gramEnd"/>
-      <w:r>
-        <w:t xml:space="preserve"> sisältö asettuu allekkain ja pysyy helposti luettavana.</w:t>
-      </w:r>
-    </w:p>
-    <w:p>
-      <w:pPr>
-        <w:pStyle w:val="Heading3"/>
-      </w:pPr>
-      <w:r>
-        <w:t xml:space="preserve">Design </w:t>
-      </w:r>
-      <w:proofErr w:type="spellStart"/>
-      <w:r>
-        <w:t>rationale</w:t>
-      </w:r>
-      <w:proofErr w:type="spellEnd"/>
-    </w:p>
-    <w:p>
-      <w:r>
-        <w:t>1. Väriteeman valinta</w:t>
-      </w:r>
-    </w:p>
-    <w:p>
-      <w:r>
-        <w:lastRenderedPageBreak/>
-        <w:t>Valitsimme sinisen värimaailman, koska se viestii luotettavuutta, energiaa ja hyvinvointia. Värit sopivat hyvin kuntosali- ja liikuntaympäristöön.</w:t>
-      </w:r>
-    </w:p>
-    <w:p>
-      <w:r>
-        <w:t>2. Korttipohjainen rakenne</w:t>
-      </w:r>
-    </w:p>
-    <w:p>
-      <w:r>
-        <w:t>Käytimme korttipohjaista layoutia, koska se tekee sisällöstä selkeää ja helposti hahmotettavaa. Kortit auttavat jakamaan informaation loogisiin osiin ja toimivat hyvin myös mobiilissa.</w:t>
-      </w:r>
-    </w:p>
-    <w:p>
-      <w:r>
-        <w:t>3. Keskitetty sisältö ja tyhjä tila</w:t>
-      </w:r>
-    </w:p>
-    <w:p>
-      <w:r>
-        <w:t>Sisältö on keskitetty ja reunoihin jätettiin tyhjää tilaa. Tämä tekee sivusta visuaalisesti selkeämmän ja helpommin luettavan.</w:t>
-      </w:r>
-    </w:p>
-    <w:p>
-      <w:r>
-        <w:t>4. Interaktiiviset elementit</w:t>
-      </w:r>
-    </w:p>
-    <w:p>
-      <w:r>
-        <w:t xml:space="preserve">Lisäsimme </w:t>
-      </w:r>
-      <w:proofErr w:type="spellStart"/>
-      <w:r>
-        <w:t>hover</w:t>
-      </w:r>
-      <w:proofErr w:type="spellEnd"/>
-      <w:r>
-        <w:t>-efektejä painikkeisiin ja linkkeihin, jotta käyttäjä saa visuaalista palautetta. Tämä tekee käyttöliittymästä intuitiivisemman ja miellyttävämmän käyttää.</w:t>
-      </w:r>
-    </w:p>
-    <w:p/>
-    <w:p>
-      <w:pPr>
-        <w:pStyle w:val="Heading2"/>
-      </w:pPr>
-      <w:bookmarkStart w:id="9" w:name="_Toc224836181"/>
-      <w:r>
-        <w:t>Lähdeviittaukset ja lähdeluettelon teko</w:t>
-      </w:r>
-      <w:bookmarkEnd w:id="9"/>
-    </w:p>
-    <w:p>
-      <w:pPr>
+      <w:r>
         <w:rPr>
           <w:rFonts w:cstheme="minorHAnsi"/>
           <w:szCs w:val="20"/>
         </w:rPr>
-      </w:pPr>
+        <w:t xml:space="preserve">APA 7 -viittaustyylistä nimiviittausta. </w:t>
+      </w:r>
       <w:r>
         <w:rPr>
           <w:rFonts w:cstheme="minorHAnsi"/>
           <w:szCs w:val="20"/>
         </w:rPr>
-        <w:t>Käytä</w:t>
-      </w:r>
-      <w:r>
+        <w:t>Esimerkkejä löydät kirjoitusohjeista (Tritonia, n.d).</w:t>
+      </w:r>
+    </w:p>
+    <w:p>
+      <w:pPr>
         <w:rPr>
           <w:rFonts w:cstheme="minorHAnsi"/>
           <w:szCs w:val="20"/>
         </w:rPr>
-        <w:t xml:space="preserve"> </w:t>
-      </w:r>
+      </w:pPr>
       <w:r>
         <w:rPr>
           <w:rFonts w:cstheme="minorHAnsi"/>
           <w:szCs w:val="20"/>
         </w:rPr>
-        <w:t xml:space="preserve">APA 7 -viittaustyylistä nimiviittausta. </w:t>
-      </w:r>
-      <w:r>
+        <w:t xml:space="preserve">Jokainen lähde, johon tekstissä on viitattu, mainitaan myös lähdeluettelossa. Vastaavasti jokaisesta lähdeluettelossa mainitusta lähteestä tulee olla viittaus tekstissä. </w:t>
+      </w:r>
+    </w:p>
+    <w:p>
+      <w:pPr>
         <w:rPr>
           <w:rFonts w:cstheme="minorHAnsi"/>
           <w:szCs w:val="20"/>
         </w:rPr>
-        <w:t xml:space="preserve">Esimerkkejä löydät kirjoitusohjeista (Tritonia, </w:t>
-      </w:r>
-      <w:proofErr w:type="spellStart"/>
+      </w:pPr>
       <w:r>
         <w:rPr>
           <w:rFonts w:cstheme="minorHAnsi"/>
           <w:szCs w:val="20"/>
         </w:rPr>
-        <w:t>n.d</w:t>
-      </w:r>
-      <w:proofErr w:type="spellEnd"/>
+        <w:t>Ota käyttöösi Mendeley tai Zotero ja kerää eri harjoitustöissä käyttämiäsi lähteitä. Niistä voi olla hyötyä opinnäytetyötä kirjoittaessasi</w:t>
+      </w:r>
       <w:r>
         <w:rPr>
           <w:rFonts w:cstheme="minorHAnsi"/>
           <w:szCs w:val="20"/>
         </w:rPr>
-        <w:t>).</w:t>
-      </w:r>
-    </w:p>
-    <w:p>
-      <w:pPr>
-        <w:rPr>
-          <w:rFonts w:cstheme="minorHAnsi"/>
-          <w:szCs w:val="20"/>
-        </w:rPr>
-      </w:pPr>
-      <w:r>
-        <w:rPr>
-          <w:rFonts w:cstheme="minorHAnsi"/>
-          <w:szCs w:val="20"/>
-        </w:rPr>
-        <w:t xml:space="preserve">Jokainen lähde, johon tekstissä on viitattu, mainitaan myös lähdeluettelossa. Vastaavasti jokaisesta lähdeluettelossa mainitusta lähteestä tulee olla viittaus tekstissä. </w:t>
-      </w:r>
-    </w:p>
-    <w:p>
-      <w:pPr>
-        <w:rPr>
-          <w:rFonts w:cstheme="minorHAnsi"/>
-          <w:szCs w:val="20"/>
-        </w:rPr>
-      </w:pPr>
-      <w:r>
-        <w:rPr>
-          <w:rFonts w:cstheme="minorHAnsi"/>
-          <w:szCs w:val="20"/>
-        </w:rPr>
-        <w:t xml:space="preserve">Ota käyttöösi </w:t>
-      </w:r>
-      <w:proofErr w:type="spellStart"/>
-      <w:r>
-        <w:rPr>
-          <w:rFonts w:cstheme="minorHAnsi"/>
-          <w:szCs w:val="20"/>
-        </w:rPr>
-        <w:t>Mendeley</w:t>
-      </w:r>
-      <w:proofErr w:type="spellEnd"/>
-      <w:r>
-        <w:rPr>
-          <w:rFonts w:cstheme="minorHAnsi"/>
-          <w:szCs w:val="20"/>
-        </w:rPr>
-        <w:t xml:space="preserve"> tai </w:t>
-      </w:r>
-      <w:proofErr w:type="spellStart"/>
-      <w:r>
-        <w:rPr>
-          <w:rFonts w:cstheme="minorHAnsi"/>
-          <w:szCs w:val="20"/>
-        </w:rPr>
-        <w:t>Zotero</w:t>
-      </w:r>
-      <w:proofErr w:type="spellEnd"/>
-      <w:r>
-        <w:rPr>
-          <w:rFonts w:cstheme="minorHAnsi"/>
-          <w:szCs w:val="20"/>
-        </w:rPr>
-        <w:t xml:space="preserve"> ja kerää eri harjoitustöissä käyttämiäsi lähteitä. Niistä voi olla hyötyä opinnäytetyötä kirjoittaessasi</w:t>
-      </w:r>
-      <w:r>
-        <w:rPr>
-          <w:rFonts w:cstheme="minorHAnsi"/>
-          <w:szCs w:val="20"/>
-        </w:rPr>
         <w:t>.</w:t>
       </w:r>
     </w:p>
@@ -2232,13 +2074,13 @@
       <w:pPr>
         <w:pStyle w:val="LhteetjaLiitteetotsikko"/>
       </w:pPr>
-      <w:bookmarkStart w:id="10" w:name="_Toc421090872"/>
-      <w:bookmarkStart w:id="11" w:name="_Toc185420493"/>
-      <w:bookmarkStart w:id="12" w:name="_Toc224836182"/>
+      <w:bookmarkStart w:id="15" w:name="_Toc421090872"/>
+      <w:bookmarkStart w:id="16" w:name="_Toc185420493"/>
+      <w:bookmarkStart w:id="17" w:name="_Toc225530390"/>
+      <w:bookmarkEnd w:id="0"/>
       <w:bookmarkEnd w:id="1"/>
       <w:bookmarkEnd w:id="2"/>
       <w:bookmarkEnd w:id="3"/>
-      <w:bookmarkEnd w:id="4"/>
       <w:r>
         <w:lastRenderedPageBreak/>
         <w:t>L</w:t>
@@ -2246,9 +2088,9 @@
       <w:r>
         <w:t>ähteet</w:t>
       </w:r>
-      <w:bookmarkEnd w:id="10"/>
-      <w:bookmarkEnd w:id="11"/>
-      <w:bookmarkEnd w:id="12"/>
+      <w:bookmarkEnd w:id="15"/>
+      <w:bookmarkEnd w:id="16"/>
+      <w:bookmarkEnd w:id="17"/>
       <w:r>
         <w:t xml:space="preserve"> </w:t>
       </w:r>
@@ -2261,15 +2103,7 @@
         <w:t>Tritonia</w:t>
       </w:r>
       <w:r>
-        <w:t>. (</w:t>
-      </w:r>
-      <w:proofErr w:type="spellStart"/>
-      <w:r>
-        <w:t>n.d</w:t>
-      </w:r>
-      <w:proofErr w:type="spellEnd"/>
-      <w:r>
-        <w:t xml:space="preserve">.). </w:t>
+        <w:t xml:space="preserve">. (n.d.). </w:t>
       </w:r>
       <w:r>
         <w:rPr>
@@ -2282,15 +2116,7 @@
         <w:t xml:space="preserve">. </w:t>
       </w:r>
       <w:r>
-        <w:t xml:space="preserve">Tritonia </w:t>
-      </w:r>
-      <w:proofErr w:type="spellStart"/>
-      <w:r>
-        <w:t>LibGuides</w:t>
-      </w:r>
-      <w:proofErr w:type="spellEnd"/>
-      <w:r>
-        <w:t xml:space="preserve">. </w:t>
+        <w:t xml:space="preserve">Tritonia LibGuides. </w:t>
       </w:r>
       <w:r>
         <w:t>Noudettu</w:t>
@@ -4447,7 +4273,9 @@
     <w:rsid w:val="00356947"/>
     <w:rsid w:val="003855B6"/>
     <w:rsid w:val="005A4C05"/>
+    <w:rsid w:val="008F1965"/>
     <w:rsid w:val="00953368"/>
+    <w:rsid w:val="00B36A45"/>
     <w:rsid w:val="00B9320B"/>
     <w:rsid w:val="00C5308C"/>
     <w:rsid w:val="00CE1B4B"/>

</xml_diff>

<commit_message>
active linkit nav, mustat tekstit vaihettu nappeihin ja korostuksen korjauksia.
</commit_message>
<xml_diff>
--- a/Tuotekehitysraportti.docx
+++ b/Tuotekehitysraportti.docx
@@ -1435,40 +1435,110 @@
           <w:rFonts w:cstheme="minorHAnsi"/>
         </w:rPr>
       </w:pPr>
-      <w:bookmarkStart w:id="0" w:name="_Toc164496814"/>
-      <w:bookmarkStart w:id="1" w:name="_Toc166464152"/>
-      <w:bookmarkStart w:id="2" w:name="_Toc230592239"/>
-      <w:bookmarkStart w:id="3" w:name="_Toc230592492"/>
-      <w:bookmarkStart w:id="4" w:name="_Toc225530379"/>
+      <w:bookmarkStart w:id="0" w:name="_Toc225530379"/>
+      <w:bookmarkStart w:id="1" w:name="_Toc164496814"/>
+      <w:bookmarkStart w:id="2" w:name="_Toc166464152"/>
+      <w:bookmarkStart w:id="3" w:name="_Toc230592239"/>
+      <w:bookmarkStart w:id="4" w:name="_Toc230592492"/>
       <w:r>
         <w:lastRenderedPageBreak/>
         <w:t>Johdanto</w:t>
       </w:r>
-      <w:bookmarkEnd w:id="4"/>
-    </w:p>
-    <w:p>
-      <w:pPr>
-        <w:rPr>
-          <w:rFonts w:cstheme="minorHAnsi"/>
-        </w:rPr>
-      </w:pPr>
-      <w:r>
-        <w:rPr>
-          <w:rFonts w:cstheme="minorHAnsi"/>
-        </w:rPr>
-        <w:t>Tässä raportissa perehdytään seuraamaan tuotekehitysprojekti 1 etenemistä. Projektin tarkoituksen on luoda verkkosivut kuvitteelliselle Northwind Gym &amp; Recovery kuntosali/palautumiskeskus kompleksille.</w:t>
-      </w:r>
+      <w:bookmarkEnd w:id="0"/>
+    </w:p>
+    <w:p>
+      <w:pPr>
+        <w:rPr>
+          <w:rFonts w:cstheme="minorHAnsi"/>
+        </w:rPr>
+      </w:pPr>
+      <w:r>
+        <w:rPr>
+          <w:rFonts w:cstheme="minorHAnsi"/>
+        </w:rPr>
+        <w:t xml:space="preserve">Tässä raportissa perehdytään seuraamaan tuotekehitysprojekti 1 etenemistä. Projektin tarkoituksen on luoda verkkosivut kuvitteelliselle </w:t>
+      </w:r>
+      <w:proofErr w:type="spellStart"/>
+      <w:r>
+        <w:rPr>
+          <w:rFonts w:cstheme="minorHAnsi"/>
+        </w:rPr>
+        <w:t>Northwind</w:t>
+      </w:r>
+      <w:proofErr w:type="spellEnd"/>
       <w:r>
         <w:rPr>
           <w:rFonts w:cstheme="minorHAnsi"/>
         </w:rPr>
         <w:t xml:space="preserve"> </w:t>
       </w:r>
-      <w:r>
-        <w:rPr>
-          <w:rFonts w:cstheme="minorHAnsi"/>
-        </w:rPr>
-        <w:t>Kohdeyleisönä sivutolle ovat aikuiset jotka harrastavat aktiivisesti liikuntaa.</w:t>
+      <w:proofErr w:type="spellStart"/>
+      <w:r>
+        <w:rPr>
+          <w:rFonts w:cstheme="minorHAnsi"/>
+        </w:rPr>
+        <w:t>Gym</w:t>
+      </w:r>
+      <w:proofErr w:type="spellEnd"/>
+      <w:r>
+        <w:rPr>
+          <w:rFonts w:cstheme="minorHAnsi"/>
+        </w:rPr>
+        <w:t xml:space="preserve"> &amp; </w:t>
+      </w:r>
+      <w:proofErr w:type="spellStart"/>
+      <w:r>
+        <w:rPr>
+          <w:rFonts w:cstheme="minorHAnsi"/>
+        </w:rPr>
+        <w:t>Recovery</w:t>
+      </w:r>
+      <w:proofErr w:type="spellEnd"/>
+      <w:r>
+        <w:rPr>
+          <w:rFonts w:cstheme="minorHAnsi"/>
+        </w:rPr>
+        <w:t xml:space="preserve"> kuntosali/palautumiskeskus kompleksille.</w:t>
+      </w:r>
+      <w:r>
+        <w:rPr>
+          <w:rFonts w:cstheme="minorHAnsi"/>
+        </w:rPr>
+        <w:t xml:space="preserve"> </w:t>
+      </w:r>
+      <w:r>
+        <w:rPr>
+          <w:rFonts w:cstheme="minorHAnsi"/>
+        </w:rPr>
+        <w:t xml:space="preserve">Kohdeyleisönä </w:t>
+      </w:r>
+      <w:proofErr w:type="spellStart"/>
+      <w:r>
+        <w:rPr>
+          <w:rFonts w:cstheme="minorHAnsi"/>
+        </w:rPr>
+        <w:t>sivutolle</w:t>
+      </w:r>
+      <w:proofErr w:type="spellEnd"/>
+      <w:r>
+        <w:rPr>
+          <w:rFonts w:cstheme="minorHAnsi"/>
+        </w:rPr>
+        <w:t xml:space="preserve"> ovat </w:t>
+      </w:r>
+      <w:proofErr w:type="gramStart"/>
+      <w:r>
+        <w:rPr>
+          <w:rFonts w:cstheme="minorHAnsi"/>
+        </w:rPr>
+        <w:t>aikuiset</w:t>
+      </w:r>
+      <w:proofErr w:type="gramEnd"/>
+      <w:r>
+        <w:rPr>
+          <w:rFonts w:cstheme="minorHAnsi"/>
+        </w:rPr>
+        <w:t xml:space="preserve"> jotka harrastavat aktiivisesti liikuntaa.</w:t>
       </w:r>
     </w:p>
     <w:p>
@@ -1494,19 +1564,117 @@
         <w:rPr>
           <w:rFonts w:cstheme="minorHAnsi"/>
         </w:rPr>
-        <w:t>HTML koodin tekovaiheessa käytin tekoälyn apua tarkastuksessa, että tekemäni HTML on varmasti wireframen mukainen, sain muutamia korjauskehotuksia tarkastuksen yhteydessä mutta nämä korjauskehoitukset sotivat vain wireframen kanssa keskenään. Gemini siis ehdotti, että navigaatio palkki olisi hyvä olla hero kuvan yläpuolella.</w:t>
-      </w:r>
-      <w:r>
-        <w:rPr>
-          <w:rFonts w:cstheme="minorHAnsi"/>
-        </w:rPr>
-        <w:t xml:space="preserve"> Pysyin kuitenkin alkuperäisessä suunnitelmassa ja pidin nav.</w:t>
-      </w:r>
-      <w:r>
-        <w:rPr>
-          <w:rFonts w:cstheme="minorHAnsi"/>
-        </w:rPr>
-        <w:t xml:space="preserve"> AI:n apua käytin myös GEO optimoinnissa lähinnä kysymyksen asetteluun, että onko se järkevämpi tehdä englanniksi vai suomeksi. Sain ehdotelman englannin kielestä niin tein sen englanniksi. </w:t>
+        <w:t xml:space="preserve">HTML koodin tekovaiheessa käytin tekoälyn apua tarkastuksessa, että tekemäni HTML on varmasti </w:t>
+      </w:r>
+      <w:proofErr w:type="spellStart"/>
+      <w:r>
+        <w:rPr>
+          <w:rFonts w:cstheme="minorHAnsi"/>
+        </w:rPr>
+        <w:t>wireframen</w:t>
+      </w:r>
+      <w:proofErr w:type="spellEnd"/>
+      <w:r>
+        <w:rPr>
+          <w:rFonts w:cstheme="minorHAnsi"/>
+        </w:rPr>
+        <w:t xml:space="preserve"> mukainen, sain muutamia korjauskehotuksia tarkastuksen yhteydessä mutta nämä </w:t>
+      </w:r>
+      <w:proofErr w:type="spellStart"/>
+      <w:r>
+        <w:rPr>
+          <w:rFonts w:cstheme="minorHAnsi"/>
+        </w:rPr>
+        <w:t>korjauskehoitukset</w:t>
+      </w:r>
+      <w:proofErr w:type="spellEnd"/>
+      <w:r>
+        <w:rPr>
+          <w:rFonts w:cstheme="minorHAnsi"/>
+        </w:rPr>
+        <w:t xml:space="preserve"> sotivat vain </w:t>
+      </w:r>
+      <w:proofErr w:type="spellStart"/>
+      <w:r>
+        <w:rPr>
+          <w:rFonts w:cstheme="minorHAnsi"/>
+        </w:rPr>
+        <w:t>wireframen</w:t>
+      </w:r>
+      <w:proofErr w:type="spellEnd"/>
+      <w:r>
+        <w:rPr>
+          <w:rFonts w:cstheme="minorHAnsi"/>
+        </w:rPr>
+        <w:t xml:space="preserve"> kanssa keskenään. </w:t>
+      </w:r>
+      <w:proofErr w:type="spellStart"/>
+      <w:r>
+        <w:rPr>
+          <w:rFonts w:cstheme="minorHAnsi"/>
+        </w:rPr>
+        <w:t>Gemini</w:t>
+      </w:r>
+      <w:proofErr w:type="spellEnd"/>
+      <w:r>
+        <w:rPr>
+          <w:rFonts w:cstheme="minorHAnsi"/>
+        </w:rPr>
+        <w:t xml:space="preserve"> siis ehdotti, että navigaatio palkki olisi hyvä olla </w:t>
+      </w:r>
+      <w:proofErr w:type="spellStart"/>
+      <w:r>
+        <w:rPr>
+          <w:rFonts w:cstheme="minorHAnsi"/>
+        </w:rPr>
+        <w:t>hero</w:t>
+      </w:r>
+      <w:proofErr w:type="spellEnd"/>
+      <w:r>
+        <w:rPr>
+          <w:rFonts w:cstheme="minorHAnsi"/>
+        </w:rPr>
+        <w:t xml:space="preserve"> kuvan yläpuolella.</w:t>
+      </w:r>
+      <w:r>
+        <w:rPr>
+          <w:rFonts w:cstheme="minorHAnsi"/>
+        </w:rPr>
+        <w:t xml:space="preserve"> Pysyin kuitenkin alkuperäisessä suunnitelmassa ja pidin </w:t>
+      </w:r>
+      <w:proofErr w:type="spellStart"/>
+      <w:r>
+        <w:rPr>
+          <w:rFonts w:cstheme="minorHAnsi"/>
+        </w:rPr>
+        <w:t>nav</w:t>
+      </w:r>
+      <w:proofErr w:type="spellEnd"/>
+      <w:r>
+        <w:rPr>
+          <w:rFonts w:cstheme="minorHAnsi"/>
+        </w:rPr>
+        <w:t>.</w:t>
+      </w:r>
+      <w:r>
+        <w:rPr>
+          <w:rFonts w:cstheme="minorHAnsi"/>
+        </w:rPr>
+        <w:t xml:space="preserve"> </w:t>
+      </w:r>
+      <w:proofErr w:type="spellStart"/>
+      <w:r>
+        <w:rPr>
+          <w:rFonts w:cstheme="minorHAnsi"/>
+        </w:rPr>
+        <w:t>AI:n</w:t>
+      </w:r>
+      <w:proofErr w:type="spellEnd"/>
+      <w:r>
+        <w:rPr>
+          <w:rFonts w:cstheme="minorHAnsi"/>
+        </w:rPr>
+        <w:t xml:space="preserve"> apua käytin myös GEO optimoinnissa lähinnä kysymyksen asetteluun, että onko se järkevämpi tehdä englanniksi vai suomeksi. Sain ehdotelman englannin kielestä niin tein sen englanniksi. </w:t>
       </w:r>
     </w:p>
     <w:p>
@@ -1524,7 +1692,15 @@
     </w:p>
     <w:p>
       <w:r>
-        <w:t>Hyödynsin tekoälyä CSS-tyylien kehittämisessä erityisesti ongelmatilanteiden ratkaisemiseen ja ulkoasun viimeistelyyn. Tekoäly auttoi esimerkiksi responsiivisuuden toteutuksessa, elementtien keskittämisessä sekä korttirakenteen yhtenäistämisessä. Lopulliset ratkaisut valitsin ja muokkasin itse, jotta ne sopivat projektin kokonaisuuteen.</w:t>
+        <w:t xml:space="preserve">Hyödynsin tekoälyä CSS-tyylien kehittämisessä erityisesti ongelmatilanteiden ratkaisemiseen ja ulkoasun viimeistelyyn. Tekoäly auttoi esimerkiksi </w:t>
+      </w:r>
+      <w:proofErr w:type="spellStart"/>
+      <w:r>
+        <w:t>responsiivisuuden</w:t>
+      </w:r>
+      <w:proofErr w:type="spellEnd"/>
+      <w:r>
+        <w:t xml:space="preserve"> toteutuksessa, elementtien keskittämisessä sekä korttirakenteen yhtenäistämisessä. Lopulliset ratkaisut valitsin ja muokkasin itse, jotta ne sopivat projektin kokonaisuuteen.</w:t>
       </w:r>
     </w:p>
     <w:p>
@@ -1576,7 +1752,21 @@
         <w:rPr>
           <w:rFonts w:cstheme="minorHAnsi"/>
         </w:rPr>
-        <w:t xml:space="preserve"> kun wireframe valmistui, kokonaisuudessaan aikaa kului noin 12</w:t>
+        <w:t xml:space="preserve"> kun </w:t>
+      </w:r>
+      <w:proofErr w:type="spellStart"/>
+      <w:r>
+        <w:rPr>
+          <w:rFonts w:cstheme="minorHAnsi"/>
+        </w:rPr>
+        <w:t>wireframe</w:t>
+      </w:r>
+      <w:proofErr w:type="spellEnd"/>
+      <w:r>
+        <w:rPr>
+          <w:rFonts w:cstheme="minorHAnsi"/>
+        </w:rPr>
+        <w:t xml:space="preserve"> valmistui, kokonaisuudessaan aikaa kului noin 12</w:t>
       </w:r>
       <w:r>
         <w:rPr>
@@ -1755,7 +1945,91 @@
           <w:rFonts w:cstheme="minorHAnsi"/>
         </w:rPr>
         <w:lastRenderedPageBreak/>
-        <w:t xml:space="preserve">24.3.2026 käytiin scrum palaveri ja katsaus verkkosivustoista, tämän perusteella päivitin NAV palkin siten että palkki pysyy koko ajan samanlaisena. Alkuun palkki oli siten että sieltä hävisi aina se millä sivulla käyttäjä on ja tilalle ilmestyi ”Etusivu” painike. Päivitin lisäksi hero kuvan kutsuvammaksi ja enemmän wireframen mukaiseksi. Jos oikeaa nettisivua tekisin niin panostaisin tähän hero kuvan muokkaukseen varmasti enemmän. Kuva alla muokatusta hero kuvasta. </w:t>
+        <w:t xml:space="preserve">24.3.2026 käytiin </w:t>
+      </w:r>
+      <w:proofErr w:type="spellStart"/>
+      <w:r>
+        <w:rPr>
+          <w:rFonts w:cstheme="minorHAnsi"/>
+        </w:rPr>
+        <w:t>scrum</w:t>
+      </w:r>
+      <w:proofErr w:type="spellEnd"/>
+      <w:r>
+        <w:rPr>
+          <w:rFonts w:cstheme="minorHAnsi"/>
+        </w:rPr>
+        <w:t xml:space="preserve"> palaveri ja katsaus verkkosivustoista, tämän perusteella päivitin NAV palkin siten että palkki pysyy koko ajan samanlaisena. Alkuun palkki oli siten että sieltä hävisi aina se millä sivulla käyttäjä on ja tilalle ilmestyi ”Etusivu” painike. Päivitin lisäksi </w:t>
+      </w:r>
+      <w:proofErr w:type="spellStart"/>
+      <w:r>
+        <w:rPr>
+          <w:rFonts w:cstheme="minorHAnsi"/>
+        </w:rPr>
+        <w:t>hero</w:t>
+      </w:r>
+      <w:proofErr w:type="spellEnd"/>
+      <w:r>
+        <w:rPr>
+          <w:rFonts w:cstheme="minorHAnsi"/>
+        </w:rPr>
+        <w:t xml:space="preserve"> kuvan kutsuvammaksi ja enemmän </w:t>
+      </w:r>
+      <w:proofErr w:type="spellStart"/>
+      <w:r>
+        <w:rPr>
+          <w:rFonts w:cstheme="minorHAnsi"/>
+        </w:rPr>
+        <w:t>wireframen</w:t>
+      </w:r>
+      <w:proofErr w:type="spellEnd"/>
+      <w:r>
+        <w:rPr>
+          <w:rFonts w:cstheme="minorHAnsi"/>
+        </w:rPr>
+        <w:t xml:space="preserve"> mukaiseksi. Jos oikeaa nettisivua </w:t>
+      </w:r>
+      <w:proofErr w:type="gramStart"/>
+      <w:r>
+        <w:rPr>
+          <w:rFonts w:cstheme="minorHAnsi"/>
+        </w:rPr>
+        <w:t>tekisin niin panostaisin</w:t>
+      </w:r>
+      <w:proofErr w:type="gramEnd"/>
+      <w:r>
+        <w:rPr>
+          <w:rFonts w:cstheme="minorHAnsi"/>
+        </w:rPr>
+        <w:t xml:space="preserve"> tähän </w:t>
+      </w:r>
+      <w:proofErr w:type="spellStart"/>
+      <w:r>
+        <w:rPr>
+          <w:rFonts w:cstheme="minorHAnsi"/>
+        </w:rPr>
+        <w:t>hero</w:t>
+      </w:r>
+      <w:proofErr w:type="spellEnd"/>
+      <w:r>
+        <w:rPr>
+          <w:rFonts w:cstheme="minorHAnsi"/>
+        </w:rPr>
+        <w:t xml:space="preserve"> kuvan muokkaukseen varmasti enemmän. Kuva alla muokatusta </w:t>
+      </w:r>
+      <w:proofErr w:type="spellStart"/>
+      <w:r>
+        <w:rPr>
+          <w:rFonts w:cstheme="minorHAnsi"/>
+        </w:rPr>
+        <w:t>hero</w:t>
+      </w:r>
+      <w:proofErr w:type="spellEnd"/>
+      <w:r>
+        <w:rPr>
+          <w:rFonts w:cstheme="minorHAnsi"/>
+        </w:rPr>
+        <w:t xml:space="preserve"> kuvasta. </w:t>
       </w:r>
     </w:p>
     <w:p>
@@ -1816,13 +2090,189 @@
         <w:rPr>
           <w:rFonts w:cstheme="minorHAnsi"/>
         </w:rPr>
-        <w:t>27.3.2026. Scrum palaverissa käytiin tuotekehitysprojektia lävitse, tähän mennessä projekti sivustolla 1 on edennyt mallikkaasti. Tänään päivitin hero kuvan vielä paremmaksi ja suoritin GEO optimoinnin sivutolle. Käytin GEO optimoinnissa AI:n apuja ja sain ehdotuksen laittaa siihen myös koordinaatit. Healthclub tyyppi on tarkempi kuin yleinen Local business. Tämä ilmeisesti auttaa näyttämään salin tiedot oikein. Contact sivulle tehty Schema.org ”contactpage” merkkinä jos tämä olisi oikea yritys niin se kertoisi googlelle joka kertoo suoraan että tämä on se paikka mistä löytyy viralliset tiedot ja keneen ottaa yhteyttä.</w:t>
-      </w:r>
-      <w:r>
-        <w:rPr>
-          <w:rFonts w:cstheme="minorHAnsi"/>
-        </w:rPr>
-        <w:t xml:space="preserve"> Jäsenyydet sivulle valikoitui ItemList-skeema joka kertoo hakukoneelle että sivu sisältää listan tuotteista ja palveluista. Tämä voi auttaa eri jäsenyysvaihtoehdot suoraan hakutuloksiin. </w:t>
+        <w:t xml:space="preserve">27.3.2026. </w:t>
+      </w:r>
+      <w:proofErr w:type="spellStart"/>
+      <w:r>
+        <w:rPr>
+          <w:rFonts w:cstheme="minorHAnsi"/>
+        </w:rPr>
+        <w:t>Scrum</w:t>
+      </w:r>
+      <w:proofErr w:type="spellEnd"/>
+      <w:r>
+        <w:rPr>
+          <w:rFonts w:cstheme="minorHAnsi"/>
+        </w:rPr>
+        <w:t xml:space="preserve"> palaverissa käytiin tuotekehitysprojektia lävitse, tähän mennessä projekti sivustolla 1 on edennyt mallikkaasti. Tänään päivitin </w:t>
+      </w:r>
+      <w:proofErr w:type="spellStart"/>
+      <w:r>
+        <w:rPr>
+          <w:rFonts w:cstheme="minorHAnsi"/>
+        </w:rPr>
+        <w:t>hero</w:t>
+      </w:r>
+      <w:proofErr w:type="spellEnd"/>
+      <w:r>
+        <w:rPr>
+          <w:rFonts w:cstheme="minorHAnsi"/>
+        </w:rPr>
+        <w:t xml:space="preserve"> kuvan vielä paremmaksi ja suoritin GEO optimoinnin </w:t>
+      </w:r>
+      <w:proofErr w:type="spellStart"/>
+      <w:r>
+        <w:rPr>
+          <w:rFonts w:cstheme="minorHAnsi"/>
+        </w:rPr>
+        <w:t>sivutolle</w:t>
+      </w:r>
+      <w:proofErr w:type="spellEnd"/>
+      <w:r>
+        <w:rPr>
+          <w:rFonts w:cstheme="minorHAnsi"/>
+        </w:rPr>
+        <w:t xml:space="preserve">. Käytin GEO optimoinnissa </w:t>
+      </w:r>
+      <w:proofErr w:type="spellStart"/>
+      <w:r>
+        <w:rPr>
+          <w:rFonts w:cstheme="minorHAnsi"/>
+        </w:rPr>
+        <w:t>AI:n</w:t>
+      </w:r>
+      <w:proofErr w:type="spellEnd"/>
+      <w:r>
+        <w:rPr>
+          <w:rFonts w:cstheme="minorHAnsi"/>
+        </w:rPr>
+        <w:t xml:space="preserve"> apuja ja sain ehdotuksen laittaa siihen myös koordinaatit. </w:t>
+      </w:r>
+      <w:proofErr w:type="spellStart"/>
+      <w:r>
+        <w:rPr>
+          <w:rFonts w:cstheme="minorHAnsi"/>
+        </w:rPr>
+        <w:t>Healthclub</w:t>
+      </w:r>
+      <w:proofErr w:type="spellEnd"/>
+      <w:r>
+        <w:rPr>
+          <w:rFonts w:cstheme="minorHAnsi"/>
+        </w:rPr>
+        <w:t xml:space="preserve"> tyyppi on tarkempi kuin yleinen </w:t>
+      </w:r>
+      <w:proofErr w:type="spellStart"/>
+      <w:r>
+        <w:rPr>
+          <w:rFonts w:cstheme="minorHAnsi"/>
+        </w:rPr>
+        <w:t>Local</w:t>
+      </w:r>
+      <w:proofErr w:type="spellEnd"/>
+      <w:r>
+        <w:rPr>
+          <w:rFonts w:cstheme="minorHAnsi"/>
+        </w:rPr>
+        <w:t xml:space="preserve"> business. Tämä ilmeisesti auttaa näyttämään salin tiedot oikein. </w:t>
+      </w:r>
+      <w:proofErr w:type="spellStart"/>
+      <w:r>
+        <w:rPr>
+          <w:rFonts w:cstheme="minorHAnsi"/>
+        </w:rPr>
+        <w:t>Contact</w:t>
+      </w:r>
+      <w:proofErr w:type="spellEnd"/>
+      <w:r>
+        <w:rPr>
+          <w:rFonts w:cstheme="minorHAnsi"/>
+        </w:rPr>
+        <w:t xml:space="preserve"> sivulle tehty Schema.org ”</w:t>
+      </w:r>
+      <w:proofErr w:type="spellStart"/>
+      <w:r>
+        <w:rPr>
+          <w:rFonts w:cstheme="minorHAnsi"/>
+        </w:rPr>
+        <w:t>contactpage</w:t>
+      </w:r>
+      <w:proofErr w:type="spellEnd"/>
+      <w:r>
+        <w:rPr>
+          <w:rFonts w:cstheme="minorHAnsi"/>
+        </w:rPr>
+        <w:t xml:space="preserve">” merkkinä jos tämä olisi oikea yritys niin se kertoisi </w:t>
+      </w:r>
+      <w:proofErr w:type="gramStart"/>
+      <w:r>
+        <w:rPr>
+          <w:rFonts w:cstheme="minorHAnsi"/>
+        </w:rPr>
+        <w:t>googlelle</w:t>
+      </w:r>
+      <w:proofErr w:type="gramEnd"/>
+      <w:r>
+        <w:rPr>
+          <w:rFonts w:cstheme="minorHAnsi"/>
+        </w:rPr>
+        <w:t xml:space="preserve"> joka kertoo </w:t>
+      </w:r>
+      <w:proofErr w:type="gramStart"/>
+      <w:r>
+        <w:rPr>
+          <w:rFonts w:cstheme="minorHAnsi"/>
+        </w:rPr>
+        <w:t>suoraan</w:t>
+      </w:r>
+      <w:proofErr w:type="gramEnd"/>
+      <w:r>
+        <w:rPr>
+          <w:rFonts w:cstheme="minorHAnsi"/>
+        </w:rPr>
+        <w:t xml:space="preserve"> että tämä on se paikka mistä löytyy viralliset tiedot ja keneen ottaa yhteyttä.</w:t>
+      </w:r>
+      <w:r>
+        <w:rPr>
+          <w:rFonts w:cstheme="minorHAnsi"/>
+        </w:rPr>
+        <w:t xml:space="preserve"> Jäsenyydet sivulle valikoitui </w:t>
+      </w:r>
+      <w:proofErr w:type="spellStart"/>
+      <w:proofErr w:type="gramStart"/>
+      <w:r>
+        <w:rPr>
+          <w:rFonts w:cstheme="minorHAnsi"/>
+        </w:rPr>
+        <w:t>ItemList</w:t>
+      </w:r>
+      <w:proofErr w:type="spellEnd"/>
+      <w:r>
+        <w:rPr>
+          <w:rFonts w:cstheme="minorHAnsi"/>
+        </w:rPr>
+        <w:t>-skeema</w:t>
+      </w:r>
+      <w:proofErr w:type="gramEnd"/>
+      <w:r>
+        <w:rPr>
+          <w:rFonts w:cstheme="minorHAnsi"/>
+        </w:rPr>
+        <w:t xml:space="preserve"> joka kertoo </w:t>
+      </w:r>
+      <w:proofErr w:type="gramStart"/>
+      <w:r>
+        <w:rPr>
+          <w:rFonts w:cstheme="minorHAnsi"/>
+        </w:rPr>
+        <w:t>hakukoneelle</w:t>
+      </w:r>
+      <w:proofErr w:type="gramEnd"/>
+      <w:r>
+        <w:rPr>
+          <w:rFonts w:cstheme="minorHAnsi"/>
+        </w:rPr>
+        <w:t xml:space="preserve"> että sivu sisältää listan tuotteista ja palveluista. Tämä voi auttaa eri jäsenyysvaihtoehdot suoraan hakutuloksiin. </w:t>
       </w:r>
     </w:p>
     <w:p>
@@ -1831,35 +2281,133 @@
       </w:pPr>
       <w:bookmarkStart w:id="9" w:name="_Toc225530384"/>
       <w:r>
+        <w:t>CSS Toteutus</w:t>
+      </w:r>
+      <w:bookmarkEnd w:id="9"/>
+    </w:p>
+    <w:p>
+      <w:pPr>
+        <w:rPr>
+          <w:rFonts w:cstheme="minorHAnsi"/>
+        </w:rPr>
+      </w:pPr>
+      <w:r>
+        <w:rPr>
+          <w:rFonts w:cstheme="minorHAnsi"/>
+        </w:rPr>
+        <w:t xml:space="preserve">Sivuston ulkoasu on toteutettu CSS:n avulla hyödyntäen </w:t>
+      </w:r>
+      <w:proofErr w:type="spellStart"/>
+      <w:r>
+        <w:rPr>
+          <w:rFonts w:cstheme="minorHAnsi"/>
+        </w:rPr>
+        <w:t>flexbox</w:t>
+      </w:r>
+      <w:proofErr w:type="spellEnd"/>
+      <w:r>
+        <w:rPr>
+          <w:rFonts w:cstheme="minorHAnsi"/>
+        </w:rPr>
+        <w:t xml:space="preserve">-layoutia, joka mahdollistaa elementtien joustavan ja selkeän asettelun eri </w:t>
+      </w:r>
+      <w:r>
+        <w:rPr>
+          <w:rFonts w:cstheme="minorHAnsi"/>
+        </w:rPr>
         <w:lastRenderedPageBreak/>
-        <w:t>CSS Toteutus</w:t>
-      </w:r>
-      <w:bookmarkEnd w:id="9"/>
-    </w:p>
-    <w:p>
-      <w:pPr>
-        <w:rPr>
-          <w:rFonts w:cstheme="minorHAnsi"/>
-        </w:rPr>
-      </w:pPr>
-      <w:r>
-        <w:rPr>
-          <w:rFonts w:cstheme="minorHAnsi"/>
-        </w:rPr>
-        <w:t>Sivuston ulkoasu on toteutettu CSS:n avulla hyödyntäen flexbox-layoutia, joka mahdollistaa elementtien joustavan asettelun eri näytöillä. Värit on määritelty :root-muuttujilla, mikä helpottaa tyylien hallintaa ja yhtenäisyyttä.</w:t>
-      </w:r>
-    </w:p>
-    <w:p>
-      <w:pPr>
-        <w:rPr>
-          <w:rFonts w:cstheme="minorHAnsi"/>
-        </w:rPr>
-      </w:pPr>
-      <w:r>
-        <w:rPr>
-          <w:rFonts w:cstheme="minorHAnsi"/>
-        </w:rPr>
-        <w:t>Käyttöliittymä on rakennettu uudelleenkäytettävistä komponenteista, kuten korteista ja palvelubokseista, joille on määritelty yhteiset tyylit kuten varjostus ja pyöristetyt kulmat. Responsiivisuus on toteutettu media queryjen avulla, jolloin sivu mukautuu mobiililaitteille ja sisältö asettuu selkeästi allekkain.</w:t>
+        <w:t xml:space="preserve">näytöille. Värit on </w:t>
+      </w:r>
+      <w:proofErr w:type="gramStart"/>
+      <w:r>
+        <w:rPr>
+          <w:rFonts w:cstheme="minorHAnsi"/>
+        </w:rPr>
+        <w:t>määritelty :</w:t>
+      </w:r>
+      <w:proofErr w:type="spellStart"/>
+      <w:r>
+        <w:rPr>
+          <w:rFonts w:cstheme="minorHAnsi"/>
+        </w:rPr>
+        <w:t>root</w:t>
+      </w:r>
+      <w:proofErr w:type="spellEnd"/>
+      <w:proofErr w:type="gramEnd"/>
+      <w:r>
+        <w:rPr>
+          <w:rFonts w:cstheme="minorHAnsi"/>
+        </w:rPr>
+        <w:t>-muuttujien avulla, mikä helpottaa tyylien hallintaa ja pitää ulkoasun yhtenäisenä koko sivuston läpi.</w:t>
+      </w:r>
+    </w:p>
+    <w:p>
+      <w:pPr>
+        <w:rPr>
+          <w:rFonts w:cstheme="minorHAnsi"/>
+        </w:rPr>
+      </w:pPr>
+      <w:r>
+        <w:rPr>
+          <w:rFonts w:cstheme="minorHAnsi"/>
+        </w:rPr>
+        <w:t>Käyttöliittymä on rakennettu uudelleenkäytettävistä komponenteista, kuten korteista ja palvelubokseista. Näille on määritelty yhteiset tyylit, kuten varjostukset ja pyöristetyt kulmat, mikä tekee ulkoasusta yhtenäisen ja viimeistellyn.</w:t>
+      </w:r>
+    </w:p>
+    <w:p>
+      <w:pPr>
+        <w:rPr>
+          <w:rFonts w:cstheme="minorHAnsi"/>
+        </w:rPr>
+      </w:pPr>
+      <w:proofErr w:type="spellStart"/>
+      <w:r>
+        <w:rPr>
+          <w:rFonts w:cstheme="minorHAnsi"/>
+        </w:rPr>
+        <w:t>Responsiivisuus</w:t>
+      </w:r>
+      <w:proofErr w:type="spellEnd"/>
+      <w:r>
+        <w:rPr>
+          <w:rFonts w:cstheme="minorHAnsi"/>
+        </w:rPr>
+        <w:t xml:space="preserve"> on toteutettu media </w:t>
+      </w:r>
+      <w:proofErr w:type="spellStart"/>
+      <w:r>
+        <w:rPr>
+          <w:rFonts w:cstheme="minorHAnsi"/>
+        </w:rPr>
+        <w:t>queryjen</w:t>
+      </w:r>
+      <w:proofErr w:type="spellEnd"/>
+      <w:r>
+        <w:rPr>
+          <w:rFonts w:cstheme="minorHAnsi"/>
+        </w:rPr>
+        <w:t xml:space="preserve"> avulla, jolloin sivu mukautuu eri näyttökokoihin. Mobiililaitteilla sisältö asettuu selkeästi allekkain ja pysyy helposti luettavana</w:t>
+      </w:r>
+    </w:p>
+    <w:p>
+      <w:pPr>
+        <w:rPr>
+          <w:rFonts w:cstheme="minorHAnsi"/>
+        </w:rPr>
+      </w:pPr>
+      <w:proofErr w:type="spellStart"/>
+      <w:r>
+        <w:rPr>
+          <w:rFonts w:cstheme="minorHAnsi"/>
+        </w:rPr>
+        <w:t>Wireframesta</w:t>
+      </w:r>
+      <w:proofErr w:type="spellEnd"/>
+      <w:r>
+        <w:rPr>
+          <w:rFonts w:cstheme="minorHAnsi"/>
+        </w:rPr>
+        <w:t xml:space="preserve"> poiketen sivustoon tehtiin joitakin muutoksia asetteluun, jotta kokonaisuus olisi käytännöllisempi ja loogisempi toteuttaa. CSS-pohjan tekemiseen kului noin 7–10 tuntia, minkä jälkeen tyylejä on muokattu ja paranneltu virheiden ilmetessä. Näihin jatkomuutoksiin kului suunnilleen saman verran aikaa. Joissakin kohdissa tehtiin myös pieniä muutoksia HTML-rakenteeseen, mutta ne eivät olleet merkittäviä.</w:t>
       </w:r>
     </w:p>
     <w:p>
@@ -1870,13 +2418,57 @@
         </w:rPr>
       </w:pPr>
       <w:bookmarkStart w:id="10" w:name="_Toc225530385"/>
+      <w:proofErr w:type="spellStart"/>
       <w:r>
         <w:rPr>
           <w:lang w:val="sv-SE"/>
         </w:rPr>
-        <w:t>Tyyliohje, desing system ja desing rationale</w:t>
+        <w:t>Tyyliohje</w:t>
+      </w:r>
+      <w:proofErr w:type="spellEnd"/>
+      <w:r>
+        <w:rPr>
+          <w:lang w:val="sv-SE"/>
+        </w:rPr>
+        <w:t xml:space="preserve">, </w:t>
+      </w:r>
+      <w:proofErr w:type="spellStart"/>
+      <w:r>
+        <w:rPr>
+          <w:lang w:val="sv-SE"/>
+        </w:rPr>
+        <w:t>desing</w:t>
+      </w:r>
+      <w:proofErr w:type="spellEnd"/>
+      <w:r>
+        <w:rPr>
+          <w:lang w:val="sv-SE"/>
+        </w:rPr>
+        <w:t xml:space="preserve"> system ja </w:t>
+      </w:r>
+      <w:proofErr w:type="spellStart"/>
+      <w:r>
+        <w:rPr>
+          <w:lang w:val="sv-SE"/>
+        </w:rPr>
+        <w:t>desing</w:t>
+      </w:r>
+      <w:proofErr w:type="spellEnd"/>
+      <w:r>
+        <w:rPr>
+          <w:lang w:val="sv-SE"/>
+        </w:rPr>
+        <w:t xml:space="preserve"> </w:t>
+      </w:r>
+      <w:proofErr w:type="spellStart"/>
+      <w:r>
+        <w:rPr>
+          <w:lang w:val="sv-SE"/>
+        </w:rPr>
+        <w:t>rationale</w:t>
       </w:r>
       <w:bookmarkEnd w:id="10"/>
+      <w:proofErr w:type="spellEnd"/>
       <w:r>
         <w:rPr>
           <w:lang w:val="sv-SE"/>
@@ -1890,7 +2482,15 @@
       </w:pPr>
       <w:bookmarkStart w:id="11" w:name="_Toc225530386"/>
       <w:r>
-        <w:t>Tyyliohje (Style guide)</w:t>
+        <w:t xml:space="preserve">Tyyliohje (Style </w:t>
+      </w:r>
+      <w:proofErr w:type="spellStart"/>
+      <w:r>
+        <w:t>guide</w:t>
+      </w:r>
+      <w:proofErr w:type="spellEnd"/>
+      <w:r>
+        <w:t>)</w:t>
       </w:r>
       <w:bookmarkEnd w:id="11"/>
     </w:p>
@@ -1901,12 +2501,42 @@
     </w:p>
     <w:p>
       <w:r>
-        <w:t>Fonttina käytetään selkeää sans-serif -fonttia (Arial), joka on helppolukuinen eri laitteilla. Otsikot, leipäteksti ja painikkeet on pidetty yksinkertaisina ja yhtenäisinä koko sivuston läpi.</w:t>
-      </w:r>
-    </w:p>
-    <w:p>
-      <w:r>
-        <w:t>Painikkeet ovat pyöristettyjä ja kontrastivärisiä, jotta ne erottuvat selkeästi ja ohjaavat käyttäjää toimintaan. Linkeissä käytetään hover-efektejä (alleviivaus), jotka parantavat käytettävyyttä.</w:t>
+        <w:t xml:space="preserve">Fonttina käytetään selkeää </w:t>
+      </w:r>
+      <w:proofErr w:type="spellStart"/>
+      <w:proofErr w:type="gramStart"/>
+      <w:r>
+        <w:t>sans-serif</w:t>
+      </w:r>
+      <w:proofErr w:type="spellEnd"/>
+      <w:r>
+        <w:t xml:space="preserve"> -fonttia</w:t>
+      </w:r>
+      <w:proofErr w:type="gramEnd"/>
+      <w:r>
+        <w:t xml:space="preserve"> (</w:t>
+      </w:r>
+      <w:proofErr w:type="spellStart"/>
+      <w:r>
+        <w:t>Arial</w:t>
+      </w:r>
+      <w:proofErr w:type="spellEnd"/>
+      <w:r>
+        <w:t>), joka on helppolukuinen eri laitteilla. Otsikot, leipäteksti ja painikkeet on pidetty yksinkertaisina ja yhtenäisinä koko sivuston läpi.</w:t>
+      </w:r>
+    </w:p>
+    <w:p>
+      <w:r>
+        <w:lastRenderedPageBreak/>
+        <w:t xml:space="preserve">Painikkeet ovat pyöristettyjä ja kontrastivärisiä, jotta ne erottuvat selkeästi ja ohjaavat käyttäjää toimintaan. Linkeissä käytetään </w:t>
+      </w:r>
+      <w:proofErr w:type="spellStart"/>
+      <w:r>
+        <w:t>hover</w:t>
+      </w:r>
+      <w:proofErr w:type="spellEnd"/>
+      <w:r>
+        <w:t>-efektejä (alleviivaus), jotka parantavat käytettävyyttä.</w:t>
       </w:r>
     </w:p>
     <w:p>
@@ -1915,74 +2545,140 @@
       </w:pPr>
       <w:bookmarkStart w:id="12" w:name="_Toc225530387"/>
       <w:r>
-        <w:t>Design system (lyhyesti)</w:t>
+        <w:t xml:space="preserve">Design </w:t>
+      </w:r>
+      <w:proofErr w:type="spellStart"/>
+      <w:r>
+        <w:t>system</w:t>
+      </w:r>
+      <w:proofErr w:type="spellEnd"/>
+      <w:r>
+        <w:t xml:space="preserve"> (lyhyesti)</w:t>
       </w:r>
       <w:bookmarkEnd w:id="12"/>
     </w:p>
     <w:p>
       <w:r>
-        <w:t>Sivusto on rakennettu modulaarisesti käyttäen toistuvia komponentteja, kuten kortteja (card), palvelubokseja ja grid-rakenteita. Tämä tekee käyttöliittymästä yhtenäisen ja helposti laajennettavan.</w:t>
+        <w:t>Sivusto on rakennettu modulaarisesti käyttäen toistuvia komponentteja, kuten kortteja (</w:t>
+      </w:r>
+      <w:proofErr w:type="spellStart"/>
+      <w:r>
+        <w:t>card</w:t>
+      </w:r>
+      <w:proofErr w:type="spellEnd"/>
+      <w:r>
+        <w:t xml:space="preserve">), palvelubokseja ja </w:t>
+      </w:r>
+      <w:proofErr w:type="spellStart"/>
+      <w:r>
+        <w:t>grid</w:t>
+      </w:r>
+      <w:proofErr w:type="spellEnd"/>
+      <w:r>
+        <w:t>-rakenteita. Tämä tekee käyttöliittymästä yhtenäisen ja helposti laajennettavan.</w:t>
+      </w:r>
+    </w:p>
+    <w:p>
+      <w:r>
+        <w:t xml:space="preserve">Layout perustuu pääasiassa </w:t>
+      </w:r>
+      <w:proofErr w:type="spellStart"/>
+      <w:r>
+        <w:t>flexboxiin</w:t>
+      </w:r>
+      <w:proofErr w:type="spellEnd"/>
+      <w:r>
+        <w:t>, jonka avulla sisältö mukautuu eri näytön kokoihin. Kortit ja sisältöelementit noudattavat samaa rakennetta: taustaväri, varjostus ja pyöristetyt kulmat.</w:t>
+      </w:r>
+    </w:p>
+    <w:p>
+      <w:proofErr w:type="spellStart"/>
+      <w:r>
+        <w:t>Responsiivisuus</w:t>
+      </w:r>
+      <w:proofErr w:type="spellEnd"/>
+      <w:r>
+        <w:t xml:space="preserve"> on toteutettu media </w:t>
+      </w:r>
+      <w:proofErr w:type="spellStart"/>
+      <w:r>
+        <w:t>queryjen</w:t>
+      </w:r>
+      <w:proofErr w:type="spellEnd"/>
+      <w:r>
+        <w:t xml:space="preserve"> avulla, jolloin sivusto toimii sekä mobiililaitteilla että suuremmilla näytöillä. </w:t>
+      </w:r>
+      <w:proofErr w:type="gramStart"/>
+      <w:r>
+        <w:t>Mobiilissa</w:t>
+      </w:r>
+      <w:proofErr w:type="gramEnd"/>
+      <w:r>
+        <w:t xml:space="preserve"> sisältö asettuu allekkain ja pysyy helposti luettavana.</w:t>
+      </w:r>
+    </w:p>
+    <w:p>
+      <w:pPr>
+        <w:pStyle w:val="Heading3"/>
+      </w:pPr>
+      <w:bookmarkStart w:id="13" w:name="_Toc225530388"/>
+      <w:r>
+        <w:t xml:space="preserve">Design </w:t>
+      </w:r>
+      <w:proofErr w:type="spellStart"/>
+      <w:r>
+        <w:t>rationale</w:t>
+      </w:r>
+      <w:bookmarkEnd w:id="13"/>
+      <w:proofErr w:type="spellEnd"/>
+    </w:p>
+    <w:p>
+      <w:r>
+        <w:t>1. Väriteeman valinta</w:t>
+      </w:r>
+    </w:p>
+    <w:p>
+      <w:r>
+        <w:t>Valitsimme sinisen värimaailman, koska se viestii luotettavuutta, energiaa ja hyvinvointia. Värit sopivat hyvin kuntosali- ja liikuntaympäristöön.</w:t>
+      </w:r>
+    </w:p>
+    <w:p>
+      <w:r>
+        <w:t>2. Korttipohjainen rakenne</w:t>
+      </w:r>
+    </w:p>
+    <w:p>
+      <w:r>
+        <w:t>Käytimme korttipohjaista layoutia, koska se tekee sisällöstä selkeää ja helposti hahmotettavaa. Kortit auttavat jakamaan informaation loogisiin osiin ja toimivat hyvin myös mobiilissa.</w:t>
+      </w:r>
+    </w:p>
+    <w:p>
+      <w:r>
+        <w:t>3. Keskitetty sisältö ja tyhjä tila</w:t>
+      </w:r>
+    </w:p>
+    <w:p>
+      <w:r>
+        <w:t>Sisältö on keskitetty ja reunoihin jätettiin tyhjää tilaa. Tämä tekee sivusta visuaalisesti selkeämmän ja helpommin luettavan.</w:t>
+      </w:r>
+    </w:p>
+    <w:p>
+      <w:r>
+        <w:t>4. Interaktiiviset elementit</w:t>
       </w:r>
     </w:p>
     <w:p>
       <w:r>
         <w:lastRenderedPageBreak/>
-        <w:t>Layout perustuu pääasiassa flexboxiin, jonka avulla sisältö mukautuu eri näytön kokoihin. Kortit ja sisältöelementit noudattavat samaa rakennetta: taustaväri, varjostus ja pyöristetyt kulmat.</w:t>
-      </w:r>
-    </w:p>
-    <w:p>
-      <w:r>
-        <w:t>Responsiivisuus on toteutettu media queryjen avulla, jolloin sivusto toimii sekä mobiililaitteilla että suuremmilla näytöillä. Mobiilissa sisältö asettuu allekkain ja pysyy helposti luettavana.</w:t>
-      </w:r>
-    </w:p>
-    <w:p>
-      <w:pPr>
-        <w:pStyle w:val="Heading3"/>
-      </w:pPr>
-      <w:bookmarkStart w:id="13" w:name="_Toc225530388"/>
-      <w:r>
-        <w:t>Design rationale</w:t>
-      </w:r>
-      <w:bookmarkEnd w:id="13"/>
-    </w:p>
-    <w:p>
-      <w:r>
-        <w:t>1. Väriteeman valinta</w:t>
-      </w:r>
-    </w:p>
-    <w:p>
-      <w:r>
-        <w:t>Valitsimme sinisen värimaailman, koska se viestii luotettavuutta, energiaa ja hyvinvointia. Värit sopivat hyvin kuntosali- ja liikuntaympäristöön.</w:t>
-      </w:r>
-    </w:p>
-    <w:p>
-      <w:r>
-        <w:t>2. Korttipohjainen rakenne</w:t>
-      </w:r>
-    </w:p>
-    <w:p>
-      <w:r>
-        <w:t>Käytimme korttipohjaista layoutia, koska se tekee sisällöstä selkeää ja helposti hahmotettavaa. Kortit auttavat jakamaan informaation loogisiin osiin ja toimivat hyvin myös mobiilissa.</w:t>
-      </w:r>
-    </w:p>
-    <w:p>
-      <w:r>
-        <w:t>3. Keskitetty sisältö ja tyhjä tila</w:t>
-      </w:r>
-    </w:p>
-    <w:p>
-      <w:r>
-        <w:t>Sisältö on keskitetty ja reunoihin jätettiin tyhjää tilaa. Tämä tekee sivusta visuaalisesti selkeämmän ja helpommin luettavan.</w:t>
-      </w:r>
-    </w:p>
-    <w:p>
-      <w:r>
-        <w:t>4. Interaktiiviset elementit</w:t>
-      </w:r>
-    </w:p>
-    <w:p>
-      <w:r>
-        <w:t>Lisäsimme hover-efektejä painikkeisiin ja linkkeihin, jotta käyttäjä saa visuaalista palautetta. Tämä tekee käyttöliittymästä intuitiivisemman ja miellyttävämmän käyttää.</w:t>
+        <w:t xml:space="preserve">Lisäsimme </w:t>
+      </w:r>
+      <w:proofErr w:type="spellStart"/>
+      <w:r>
+        <w:t>hover</w:t>
+      </w:r>
+      <w:proofErr w:type="spellEnd"/>
+      <w:r>
+        <w:t>-efektejä painikkeisiin ja linkkeihin, jotta käyttäjä saa visuaalista palautetta. Tämä tekee käyttöliittymästä intuitiivisemman ja miellyttävämmän käyttää.</w:t>
       </w:r>
     </w:p>
     <w:p/>
@@ -1992,7 +2688,6 @@
       </w:pPr>
       <w:bookmarkStart w:id="14" w:name="_Toc225530389"/>
       <w:r>
-        <w:lastRenderedPageBreak/>
         <w:t>Lähdeviittaukset ja lähdeluettelon teko</w:t>
       </w:r>
       <w:bookmarkEnd w:id="14"/>
@@ -2030,21 +2725,37 @@
           <w:rFonts w:cstheme="minorHAnsi"/>
           <w:szCs w:val="20"/>
         </w:rPr>
-        <w:t>Esimerkkejä löydät kirjoitusohjeista (Tritonia, n.d).</w:t>
-      </w:r>
-    </w:p>
-    <w:p>
-      <w:pPr>
+        <w:t xml:space="preserve">Esimerkkejä löydät kirjoitusohjeista (Tritonia, </w:t>
+      </w:r>
+      <w:proofErr w:type="spellStart"/>
+      <w:r>
         <w:rPr>
           <w:rFonts w:cstheme="minorHAnsi"/>
           <w:szCs w:val="20"/>
         </w:rPr>
-      </w:pPr>
+        <w:t>n.d</w:t>
+      </w:r>
+      <w:proofErr w:type="spellEnd"/>
       <w:r>
         <w:rPr>
           <w:rFonts w:cstheme="minorHAnsi"/>
           <w:szCs w:val="20"/>
         </w:rPr>
+        <w:t>).</w:t>
+      </w:r>
+    </w:p>
+    <w:p>
+      <w:pPr>
+        <w:rPr>
+          <w:rFonts w:cstheme="minorHAnsi"/>
+          <w:szCs w:val="20"/>
+        </w:rPr>
+      </w:pPr>
+      <w:r>
+        <w:rPr>
+          <w:rFonts w:cstheme="minorHAnsi"/>
+          <w:szCs w:val="20"/>
+        </w:rPr>
         <w:t xml:space="preserve">Jokainen lähde, johon tekstissä on viitattu, mainitaan myös lähdeluettelossa. Vastaavasti jokaisesta lähdeluettelossa mainitusta lähteestä tulee olla viittaus tekstissä. </w:t>
       </w:r>
     </w:p>
@@ -2060,7 +2771,39 @@
           <w:rFonts w:cstheme="minorHAnsi"/>
           <w:szCs w:val="20"/>
         </w:rPr>
-        <w:t>Ota käyttöösi Mendeley tai Zotero ja kerää eri harjoitustöissä käyttämiäsi lähteitä. Niistä voi olla hyötyä opinnäytetyötä kirjoittaessasi</w:t>
+        <w:t xml:space="preserve">Ota käyttöösi </w:t>
+      </w:r>
+      <w:proofErr w:type="spellStart"/>
+      <w:r>
+        <w:rPr>
+          <w:rFonts w:cstheme="minorHAnsi"/>
+          <w:szCs w:val="20"/>
+        </w:rPr>
+        <w:t>Mendeley</w:t>
+      </w:r>
+      <w:proofErr w:type="spellEnd"/>
+      <w:r>
+        <w:rPr>
+          <w:rFonts w:cstheme="minorHAnsi"/>
+          <w:szCs w:val="20"/>
+        </w:rPr>
+        <w:t xml:space="preserve"> tai </w:t>
+      </w:r>
+      <w:proofErr w:type="spellStart"/>
+      <w:r>
+        <w:rPr>
+          <w:rFonts w:cstheme="minorHAnsi"/>
+          <w:szCs w:val="20"/>
+        </w:rPr>
+        <w:t>Zotero</w:t>
+      </w:r>
+      <w:proofErr w:type="spellEnd"/>
+      <w:r>
+        <w:rPr>
+          <w:rFonts w:cstheme="minorHAnsi"/>
+          <w:szCs w:val="20"/>
+        </w:rPr>
+        <w:t xml:space="preserve"> ja kerää eri harjoitustöissä käyttämiäsi lähteitä. Niistä voi olla hyötyä opinnäytetyötä kirjoittaessasi</w:t>
       </w:r>
       <w:r>
         <w:rPr>
@@ -2077,10 +2820,10 @@
       <w:bookmarkStart w:id="15" w:name="_Toc421090872"/>
       <w:bookmarkStart w:id="16" w:name="_Toc185420493"/>
       <w:bookmarkStart w:id="17" w:name="_Toc225530390"/>
-      <w:bookmarkEnd w:id="0"/>
       <w:bookmarkEnd w:id="1"/>
       <w:bookmarkEnd w:id="2"/>
       <w:bookmarkEnd w:id="3"/>
+      <w:bookmarkEnd w:id="4"/>
       <w:r>
         <w:lastRenderedPageBreak/>
         <w:t>L</w:t>
@@ -2103,7 +2846,15 @@
         <w:t>Tritonia</w:t>
       </w:r>
       <w:r>
-        <w:t xml:space="preserve">. (n.d.). </w:t>
+        <w:t>. (</w:t>
+      </w:r>
+      <w:proofErr w:type="spellStart"/>
+      <w:r>
+        <w:t>n.d</w:t>
+      </w:r>
+      <w:proofErr w:type="spellEnd"/>
+      <w:r>
+        <w:t xml:space="preserve">.). </w:t>
       </w:r>
       <w:r>
         <w:rPr>
@@ -2116,7 +2867,15 @@
         <w:t xml:space="preserve">. </w:t>
       </w:r>
       <w:r>
-        <w:t xml:space="preserve">Tritonia LibGuides. </w:t>
+        <w:t xml:space="preserve">Tritonia </w:t>
+      </w:r>
+      <w:proofErr w:type="spellStart"/>
+      <w:r>
+        <w:t>LibGuides</w:t>
+      </w:r>
+      <w:proofErr w:type="spellEnd"/>
+      <w:r>
+        <w:t xml:space="preserve">. </w:t>
       </w:r>
       <w:r>
         <w:t>Noudettu</w:t>
@@ -4272,7 +5031,9 @@
     <w:rsid w:val="002F1359"/>
     <w:rsid w:val="00356947"/>
     <w:rsid w:val="003855B6"/>
+    <w:rsid w:val="00416E2D"/>
     <w:rsid w:val="005A4C05"/>
+    <w:rsid w:val="00882CC4"/>
     <w:rsid w:val="008F1965"/>
     <w:rsid w:val="00953368"/>
     <w:rsid w:val="00B36A45"/>

</xml_diff>